<commit_message>
Deploying to gh-pages from @ Morrison-Lab/sds@a0c9aa5f9a2882b098358d4b0f61c45551eddb12 🚀
</commit_message>
<xml_diff>
--- a/classification-handout.docx
+++ b/classification-handout.docx
@@ -15,7 +15,7 @@
         <w:pStyle w:val="Date"/>
       </w:pPr>
       <w:r>
-        <w:t xml:space="preserve">Last modified: 2026-10-15 03:11:32 (PDT)</w:t>
+        <w:t xml:space="preserve">Last modified: 2026-10-15 03:26:43 (PDT)</w:t>
       </w:r>
     </w:p>
     <w:bookmarkStart w:id="16" w:name="introduction"/>
@@ -3921,7 +3921,7 @@
     </w:p>
     <w:bookmarkEnd w:id="42"/>
     <w:bookmarkEnd w:id="43"/>
-    <w:bookmarkStart w:id="59" w:name="X076ffac91629c23ab63ea48ae4a49dc44f38759"/>
+    <w:bookmarkStart w:id="63" w:name="X076ffac91629c23ab63ea48ae4a49dc44f38759"/>
     <w:p>
       <w:pPr>
         <w:pStyle w:val="Heading2"/>
@@ -5167,10 +5167,371 @@
       <w:bookmarkEnd w:id="45"/>
     </w:p>
     <w:bookmarkEnd w:id="46"/>
-    <w:bookmarkStart w:id="47" w:name="exr-ppv-bayes"/>
+    <w:bookmarkStart w:id="48" w:name="thm-prob-positive"/>
     <w:p>
       <w:pPr>
         <w:pStyle w:val="FirstParagraph"/>
+      </w:pPr>
+      <w:r>
+        <w:rPr>
+          <w:b/>
+          <w:bCs/>
+        </w:rPr>
+        <w:t xml:space="preserve">Theorem 1 (Probability of a positive test)</w:t>
+      </w:r>
+      <w:r>
+        <w:t xml:space="preserve"> </w:t>
+      </w:r>
+      <w:r>
+        <w:t xml:space="preserve">Let</w:t>
+      </w:r>
+      <w:r>
+        <w:t xml:space="preserve"> </w:t>
+      </w:r>
+      <m:oMath>
+        <m:r>
+          <m:rPr>
+            <m:nor/>
+            <m:sty m:val="p"/>
+          </m:rPr>
+          <m:t>sens</m:t>
+        </m:r>
+      </m:oMath>
+      <w:r>
+        <w:t xml:space="preserve"> </w:t>
+      </w:r>
+      <w:r>
+        <w:t xml:space="preserve">be the</w:t>
+      </w:r>
+      <w:r>
+        <w:t xml:space="preserve"> </w:t>
+      </w:r>
+      <w:hyperlink w:anchor="def-sensitivity">
+        <w:r>
+          <w:rPr>
+            <w:rStyle w:val="Hyperlink"/>
+          </w:rPr>
+          <w:t xml:space="preserve">sensitivity</w:t>
+        </w:r>
+      </w:hyperlink>
+      <w:r>
+        <w:t xml:space="preserve"> </w:t>
+      </w:r>
+      <w:r>
+        <w:t xml:space="preserve">of a diagnostic test,</w:t>
+      </w:r>
+      <w:r>
+        <w:t xml:space="preserve"> </w:t>
+      </w:r>
+      <m:oMath>
+        <m:r>
+          <m:rPr>
+            <m:nor/>
+            <m:sty m:val="p"/>
+          </m:rPr>
+          <m:t>spec</m:t>
+        </m:r>
+      </m:oMath>
+      <w:r>
+        <w:t xml:space="preserve"> </w:t>
+      </w:r>
+      <w:r>
+        <w:t xml:space="preserve">its</w:t>
+      </w:r>
+      <w:r>
+        <w:t xml:space="preserve"> </w:t>
+      </w:r>
+      <w:hyperlink w:anchor="def-specificity">
+        <w:r>
+          <w:rPr>
+            <w:rStyle w:val="Hyperlink"/>
+          </w:rPr>
+          <w:t xml:space="preserve">specificity</w:t>
+        </w:r>
+      </w:hyperlink>
+      <w:r>
+        <w:t xml:space="preserve">,</w:t>
+      </w:r>
+      <w:r>
+        <w:t xml:space="preserve"> </w:t>
+      </w:r>
+      <w:r>
+        <w:t xml:space="preserve">and</w:t>
+      </w:r>
+      <w:r>
+        <w:t xml:space="preserve"> </w:t>
+      </w:r>
+      <m:oMath>
+        <m:r>
+          <m:t>π</m:t>
+        </m:r>
+      </m:oMath>
+      <w:r>
+        <w:t xml:space="preserve"> </w:t>
+      </w:r>
+      <w:r>
+        <w:t xml:space="preserve">the</w:t>
+      </w:r>
+      <w:r>
+        <w:t xml:space="preserve"> </w:t>
+      </w:r>
+      <w:hyperlink w:anchor="def-prevalence">
+        <w:r>
+          <w:rPr>
+            <w:rStyle w:val="Hyperlink"/>
+          </w:rPr>
+          <w:t xml:space="preserve">prevalence</w:t>
+        </w:r>
+      </w:hyperlink>
+      <w:r>
+        <w:t xml:space="preserve"> </w:t>
+      </w:r>
+      <w:r>
+        <w:t xml:space="preserve">of the disease.</w:t>
+      </w:r>
+      <w:r>
+        <w:t xml:space="preserve"> </w:t>
+      </w:r>
+      <w:r>
+        <w:t xml:space="preserve">Then the probability</w:t>
+      </w:r>
+      <w:r>
+        <w:t xml:space="preserve"> </w:t>
+      </w:r>
+      <m:oMath>
+        <m:r>
+          <m:rPr>
+            <m:sty m:val="p"/>
+          </m:rPr>
+          <m:t>Pr</m:t>
+        </m:r>
+        <m:r>
+          <m:rPr>
+            <m:sty m:val="p"/>
+          </m:rPr>
+          <m:t>(</m:t>
+        </m:r>
+        <m:r>
+          <m:rPr>
+            <m:sty m:val="p"/>
+          </m:rPr>
+          <m:t>+</m:t>
+        </m:r>
+        <m:r>
+          <m:rPr>
+            <m:sty m:val="p"/>
+          </m:rPr>
+          <m:t>)</m:t>
+        </m:r>
+      </m:oMath>
+      <w:r>
+        <w:t xml:space="preserve"> </w:t>
+      </w:r>
+      <w:r>
+        <w:t xml:space="preserve">that the test is positive is:</w:t>
+      </w:r>
+    </w:p>
+    <w:p>
+      <w:pPr>
+        <w:pStyle w:val="BodyText"/>
+      </w:pPr>
+      <w:bookmarkStart w:id="47" w:name="eq-prob-positive"/>
+      <m:oMathPara>
+        <m:oMathParaPr>
+          <m:jc m:val="center"/>
+        </m:oMathParaPr>
+        <m:oMath>
+          <m:r>
+            <m:rPr>
+              <m:sty m:val="p"/>
+            </m:rPr>
+            <m:t>Pr</m:t>
+          </m:r>
+          <m:r>
+            <m:rPr>
+              <m:sty m:val="p"/>
+            </m:rPr>
+            <m:t>(</m:t>
+          </m:r>
+          <m:r>
+            <m:rPr>
+              <m:sty m:val="p"/>
+            </m:rPr>
+            <m:t>+</m:t>
+          </m:r>
+          <m:r>
+            <m:rPr>
+              <m:sty m:val="p"/>
+            </m:rPr>
+            <m:t>)</m:t>
+          </m:r>
+          <m:r>
+            <m:rPr>
+              <m:sty m:val="p"/>
+            </m:rPr>
+            <m:t>=</m:t>
+          </m:r>
+          <m:r>
+            <m:rPr>
+              <m:nor/>
+              <m:sty m:val="p"/>
+            </m:rPr>
+            <m:t>sens</m:t>
+          </m:r>
+          <m:r>
+            <m:rPr>
+              <m:sty m:val="p"/>
+            </m:rPr>
+            <m:t>⋅</m:t>
+          </m:r>
+          <m:r>
+            <m:t>π</m:t>
+          </m:r>
+          <m:r>
+            <m:rPr>
+              <m:sty m:val="p"/>
+            </m:rPr>
+            <m:t>+</m:t>
+          </m:r>
+          <m:r>
+            <m:t>​</m:t>
+          </m:r>
+          <m:d>
+            <m:dPr>
+              <m:begChr m:val="("/>
+              <m:sepChr m:val=""/>
+              <m:endChr m:val=")"/>
+              <m:grow/>
+            </m:dPr>
+            <m:e>
+              <m:r>
+                <m:t>1</m:t>
+              </m:r>
+              <m:r>
+                <m:rPr>
+                  <m:sty m:val="p"/>
+                </m:rPr>
+                <m:t>−</m:t>
+              </m:r>
+              <m:r>
+                <m:rPr>
+                  <m:nor/>
+                  <m:sty m:val="p"/>
+                </m:rPr>
+                <m:t>spec</m:t>
+              </m:r>
+            </m:e>
+          </m:d>
+          <m:r>
+            <m:t>​</m:t>
+          </m:r>
+          <m:r>
+            <m:rPr>
+              <m:sty m:val="p"/>
+            </m:rPr>
+            <m:t>⋅</m:t>
+          </m:r>
+          <m:r>
+            <m:t>​</m:t>
+          </m:r>
+          <m:d>
+            <m:dPr>
+              <m:begChr m:val="("/>
+              <m:sepChr m:val=""/>
+              <m:endChr m:val=")"/>
+              <m:grow/>
+            </m:dPr>
+            <m:e>
+              <m:r>
+                <m:t>1</m:t>
+              </m:r>
+              <m:r>
+                <m:rPr>
+                  <m:sty m:val="p"/>
+                </m:rPr>
+                <m:t>−</m:t>
+              </m:r>
+              <m:r>
+                <m:t>π</m:t>
+              </m:r>
+            </m:e>
+          </m:d>
+          <m:r>
+            <m:t>​</m:t>
+          </m:r>
+          <m:r>
+            <m:t>  </m:t>
+          </m:r>
+          <m:r>
+            <m:rPr>
+              <m:sty m:val="p"/>
+            </m:rPr>
+            <m:t>(</m:t>
+          </m:r>
+          <m:r>
+            <m:t>17</m:t>
+          </m:r>
+          <m:r>
+            <m:rPr>
+              <m:sty m:val="p"/>
+            </m:rPr>
+            <m:t>)</m:t>
+          </m:r>
+        </m:oMath>
+      </m:oMathPara>
+      <w:bookmarkEnd w:id="47"/>
+    </w:p>
+    <w:bookmarkEnd w:id="48"/>
+    <w:p>
+      <w:pPr>
+        <w:pStyle w:val="FirstParagraph"/>
+      </w:pPr>
+      <w:r>
+        <w:rPr>
+          <w:i/>
+          <w:iCs/>
+        </w:rPr>
+        <w:t xml:space="preserve">Proof</w:t>
+      </w:r>
+      <w:r>
+        <w:t xml:space="preserve">. </w:t>
+      </w:r>
+      <w:r>
+        <w:t xml:space="preserve">This is the solution to</w:t>
+      </w:r>
+      <w:r>
+        <w:t xml:space="preserve"> </w:t>
+      </w:r>
+      <w:hyperlink w:anchor="exr-prob-positive">
+        <w:r>
+          <w:rPr>
+            <w:rStyle w:val="Hyperlink"/>
+          </w:rPr>
+          <w:t xml:space="preserve">Exercise 1</w:t>
+        </w:r>
+      </w:hyperlink>
+      <w:r>
+        <w:t xml:space="preserve">, worked in</w:t>
+      </w:r>
+      <w:r>
+        <w:t xml:space="preserve"> </w:t>
+      </w:r>
+      <w:hyperlink w:anchor="sol-prob-positive">
+        <w:r>
+          <w:rPr>
+            <w:rStyle w:val="Hyperlink"/>
+          </w:rPr>
+          <w:t xml:space="preserve">Solution 1</w:t>
+        </w:r>
+      </w:hyperlink>
+      <w:r>
+        <w:t xml:space="preserve">.</w:t>
+      </w:r>
+    </w:p>
+    <w:bookmarkStart w:id="49" w:name="exr-ppv-bayes"/>
+    <w:p>
+      <w:pPr>
+        <w:pStyle w:val="BodyText"/>
       </w:pPr>
       <w:r>
         <w:rPr>
@@ -5290,8 +5651,8 @@
         <w:t xml:space="preserve">of the disease.</w:t>
       </w:r>
     </w:p>
-    <w:bookmarkEnd w:id="47"/>
-    <w:bookmarkStart w:id="49" w:name="sol-ppv-bayes"/>
+    <w:bookmarkEnd w:id="49"/>
+    <w:bookmarkStart w:id="51" w:name="sol-ppv-bayes"/>
     <w:p>
       <w:pPr>
         <w:pStyle w:val="FirstParagraph"/>
@@ -5407,7 +5768,7 @@
       <w:pPr>
         <w:pStyle w:val="BodyText"/>
       </w:pPr>
-      <w:bookmarkStart w:id="48" w:name="eq-ppv-bayes-exr"/>
+      <w:bookmarkStart w:id="50" w:name="eq-ppv-bayes-exr"/>
       <m:oMathPara>
         <m:oMathParaPr>
           <m:jc m:val="center"/>
@@ -5920,7 +6281,7 @@
             <m:t>(</m:t>
           </m:r>
           <m:r>
-            <m:t>17</m:t>
+            <m:t>18</m:t>
           </m:r>
           <m:r>
             <m:rPr>
@@ -5930,10 +6291,10 @@
           </m:r>
         </m:oMath>
       </m:oMathPara>
-      <w:bookmarkEnd w:id="48"/>
+      <w:bookmarkEnd w:id="50"/>
     </w:p>
-    <w:bookmarkEnd w:id="49"/>
-    <w:bookmarkStart w:id="50" w:name="exr-ppv-ratio-form"/>
+    <w:bookmarkEnd w:id="51"/>
+    <w:bookmarkStart w:id="53" w:name="thm-ppv-bayes"/>
     <w:p>
       <w:pPr>
         <w:pStyle w:val="FirstParagraph"/>
@@ -5943,13 +6304,428 @@
           <w:b/>
           <w:bCs/>
         </w:rPr>
-        <w:t xml:space="preserve">Exercise 3 (PPV in terms of two ratios)</w:t>
-      </w:r>
-      <w:r>
-        <w:t xml:space="preserve"> </w:t>
-      </w:r>
-      <w:r>
-        <w:t xml:space="preserve">Rewrite the expression for the positive predictive value from</w:t>
+        <w:t xml:space="preserve">Theorem 2 (PPV from Bayes’ theorem)</w:t>
+      </w:r>
+      <w:r>
+        <w:t xml:space="preserve"> </w:t>
+      </w:r>
+      <w:r>
+        <w:t xml:space="preserve">Let</w:t>
+      </w:r>
+      <w:r>
+        <w:t xml:space="preserve"> </w:t>
+      </w:r>
+      <m:oMath>
+        <m:r>
+          <m:rPr>
+            <m:nor/>
+            <m:sty m:val="p"/>
+          </m:rPr>
+          <m:t>sens</m:t>
+        </m:r>
+      </m:oMath>
+      <w:r>
+        <w:t xml:space="preserve"> </w:t>
+      </w:r>
+      <w:r>
+        <w:t xml:space="preserve">be the</w:t>
+      </w:r>
+      <w:r>
+        <w:t xml:space="preserve"> </w:t>
+      </w:r>
+      <w:hyperlink w:anchor="def-sensitivity">
+        <w:r>
+          <w:rPr>
+            <w:rStyle w:val="Hyperlink"/>
+          </w:rPr>
+          <w:t xml:space="preserve">sensitivity</w:t>
+        </w:r>
+      </w:hyperlink>
+      <w:r>
+        <w:t xml:space="preserve"> </w:t>
+      </w:r>
+      <w:r>
+        <w:t xml:space="preserve">of a diagnostic test,</w:t>
+      </w:r>
+      <w:r>
+        <w:t xml:space="preserve"> </w:t>
+      </w:r>
+      <m:oMath>
+        <m:r>
+          <m:rPr>
+            <m:nor/>
+            <m:sty m:val="p"/>
+          </m:rPr>
+          <m:t>spec</m:t>
+        </m:r>
+      </m:oMath>
+      <w:r>
+        <w:t xml:space="preserve"> </w:t>
+      </w:r>
+      <w:r>
+        <w:t xml:space="preserve">its</w:t>
+      </w:r>
+      <w:r>
+        <w:t xml:space="preserve"> </w:t>
+      </w:r>
+      <w:hyperlink w:anchor="def-specificity">
+        <w:r>
+          <w:rPr>
+            <w:rStyle w:val="Hyperlink"/>
+          </w:rPr>
+          <w:t xml:space="preserve">specificity</w:t>
+        </w:r>
+      </w:hyperlink>
+      <w:r>
+        <w:t xml:space="preserve">,</w:t>
+      </w:r>
+      <w:r>
+        <w:t xml:space="preserve"> </w:t>
+      </w:r>
+      <w:r>
+        <w:t xml:space="preserve">and</w:t>
+      </w:r>
+      <w:r>
+        <w:t xml:space="preserve"> </w:t>
+      </w:r>
+      <m:oMath>
+        <m:r>
+          <m:t>π</m:t>
+        </m:r>
+      </m:oMath>
+      <w:r>
+        <w:t xml:space="preserve"> </w:t>
+      </w:r>
+      <w:r>
+        <w:t xml:space="preserve">the</w:t>
+      </w:r>
+      <w:r>
+        <w:t xml:space="preserve"> </w:t>
+      </w:r>
+      <w:hyperlink w:anchor="def-prevalence">
+        <w:r>
+          <w:rPr>
+            <w:rStyle w:val="Hyperlink"/>
+          </w:rPr>
+          <w:t xml:space="preserve">prevalence</w:t>
+        </w:r>
+      </w:hyperlink>
+      <w:r>
+        <w:t xml:space="preserve"> </w:t>
+      </w:r>
+      <w:r>
+        <w:t xml:space="preserve">of the disease.</w:t>
+      </w:r>
+      <w:r>
+        <w:t xml:space="preserve"> </w:t>
+      </w:r>
+      <w:r>
+        <w:t xml:space="preserve">If the probability of a positive test is positive,</w:t>
+      </w:r>
+      <w:r>
+        <w:t xml:space="preserve"> </w:t>
+      </w:r>
+      <m:oMath>
+        <m:r>
+          <m:rPr>
+            <m:nor/>
+            <m:sty m:val="p"/>
+          </m:rPr>
+          <m:t>sens</m:t>
+        </m:r>
+        <m:r>
+          <m:rPr>
+            <m:sty m:val="p"/>
+          </m:rPr>
+          <m:t>⋅</m:t>
+        </m:r>
+        <m:r>
+          <m:t>π</m:t>
+        </m:r>
+        <m:r>
+          <m:rPr>
+            <m:sty m:val="p"/>
+          </m:rPr>
+          <m:t>+</m:t>
+        </m:r>
+        <m:r>
+          <m:t>​</m:t>
+        </m:r>
+        <m:d>
+          <m:dPr>
+            <m:begChr m:val="("/>
+            <m:sepChr m:val=""/>
+            <m:endChr m:val=")"/>
+            <m:grow/>
+          </m:dPr>
+          <m:e>
+            <m:r>
+              <m:t>1</m:t>
+            </m:r>
+            <m:r>
+              <m:rPr>
+                <m:sty m:val="p"/>
+              </m:rPr>
+              <m:t>−</m:t>
+            </m:r>
+            <m:r>
+              <m:rPr>
+                <m:nor/>
+                <m:sty m:val="p"/>
+              </m:rPr>
+              <m:t>spec</m:t>
+            </m:r>
+          </m:e>
+        </m:d>
+        <m:r>
+          <m:t>​</m:t>
+        </m:r>
+        <m:r>
+          <m:rPr>
+            <m:sty m:val="p"/>
+          </m:rPr>
+          <m:t>⋅</m:t>
+        </m:r>
+        <m:r>
+          <m:t>​</m:t>
+        </m:r>
+        <m:d>
+          <m:dPr>
+            <m:begChr m:val="("/>
+            <m:sepChr m:val=""/>
+            <m:endChr m:val=")"/>
+            <m:grow/>
+          </m:dPr>
+          <m:e>
+            <m:r>
+              <m:t>1</m:t>
+            </m:r>
+            <m:r>
+              <m:rPr>
+                <m:sty m:val="p"/>
+              </m:rPr>
+              <m:t>−</m:t>
+            </m:r>
+            <m:r>
+              <m:t>π</m:t>
+            </m:r>
+          </m:e>
+        </m:d>
+        <m:r>
+          <m:t>​</m:t>
+        </m:r>
+        <m:r>
+          <m:rPr>
+            <m:sty m:val="p"/>
+          </m:rPr>
+          <m:t>&gt;</m:t>
+        </m:r>
+        <m:r>
+          <m:t>0</m:t>
+        </m:r>
+      </m:oMath>
+      <w:r>
+        <w:t xml:space="preserve">,</w:t>
+      </w:r>
+      <w:r>
+        <w:t xml:space="preserve"> </w:t>
+      </w:r>
+      <w:r>
+        <w:t xml:space="preserve">then the</w:t>
+      </w:r>
+      <w:r>
+        <w:t xml:space="preserve"> </w:t>
+      </w:r>
+      <w:hyperlink w:anchor="def-ppv">
+        <w:r>
+          <w:rPr>
+            <w:rStyle w:val="Hyperlink"/>
+          </w:rPr>
+          <w:t xml:space="preserve">positive predictive value</w:t>
+        </w:r>
+      </w:hyperlink>
+      <w:r>
+        <w:t xml:space="preserve"> </w:t>
+      </w:r>
+      <w:r>
+        <w:t xml:space="preserve">of the test is:</w:t>
+      </w:r>
+    </w:p>
+    <w:p>
+      <w:pPr>
+        <w:pStyle w:val="BodyText"/>
+      </w:pPr>
+      <w:bookmarkStart w:id="52" w:name="eq-ppv-bayes"/>
+      <m:oMathPara>
+        <m:oMathParaPr>
+          <m:jc m:val="center"/>
+        </m:oMathParaPr>
+        <m:oMath>
+          <m:r>
+            <m:rPr>
+              <m:nor/>
+              <m:sty m:val="p"/>
+            </m:rPr>
+            <m:t>PPV</m:t>
+          </m:r>
+          <m:r>
+            <m:rPr>
+              <m:sty m:val="p"/>
+            </m:rPr>
+            <m:t>=</m:t>
+          </m:r>
+          <m:f>
+            <m:fPr>
+              <m:type m:val="bar"/>
+            </m:fPr>
+            <m:num>
+              <m:r>
+                <m:rPr>
+                  <m:nor/>
+                  <m:sty m:val="p"/>
+                </m:rPr>
+                <m:t>sens</m:t>
+              </m:r>
+              <m:r>
+                <m:rPr>
+                  <m:sty m:val="p"/>
+                </m:rPr>
+                <m:t>⋅</m:t>
+              </m:r>
+              <m:r>
+                <m:t>π</m:t>
+              </m:r>
+            </m:num>
+            <m:den>
+              <m:r>
+                <m:rPr>
+                  <m:nor/>
+                  <m:sty m:val="p"/>
+                </m:rPr>
+                <m:t>sens</m:t>
+              </m:r>
+              <m:r>
+                <m:rPr>
+                  <m:sty m:val="p"/>
+                </m:rPr>
+                <m:t>⋅</m:t>
+              </m:r>
+              <m:r>
+                <m:t>π</m:t>
+              </m:r>
+              <m:r>
+                <m:rPr>
+                  <m:sty m:val="p"/>
+                </m:rPr>
+                <m:t>+</m:t>
+              </m:r>
+              <m:r>
+                <m:t>​</m:t>
+              </m:r>
+              <m:d>
+                <m:dPr>
+                  <m:begChr m:val="("/>
+                  <m:sepChr m:val=""/>
+                  <m:endChr m:val=")"/>
+                  <m:grow/>
+                </m:dPr>
+                <m:e>
+                  <m:r>
+                    <m:t>1</m:t>
+                  </m:r>
+                  <m:r>
+                    <m:rPr>
+                      <m:sty m:val="p"/>
+                    </m:rPr>
+                    <m:t>−</m:t>
+                  </m:r>
+                  <m:r>
+                    <m:rPr>
+                      <m:nor/>
+                      <m:sty m:val="p"/>
+                    </m:rPr>
+                    <m:t>spec</m:t>
+                  </m:r>
+                </m:e>
+              </m:d>
+              <m:r>
+                <m:t>​</m:t>
+              </m:r>
+              <m:r>
+                <m:rPr>
+                  <m:sty m:val="p"/>
+                </m:rPr>
+                <m:t>⋅</m:t>
+              </m:r>
+              <m:r>
+                <m:t>​</m:t>
+              </m:r>
+              <m:d>
+                <m:dPr>
+                  <m:begChr m:val="("/>
+                  <m:sepChr m:val=""/>
+                  <m:endChr m:val=")"/>
+                  <m:grow/>
+                </m:dPr>
+                <m:e>
+                  <m:r>
+                    <m:t>1</m:t>
+                  </m:r>
+                  <m:r>
+                    <m:rPr>
+                      <m:sty m:val="p"/>
+                    </m:rPr>
+                    <m:t>−</m:t>
+                  </m:r>
+                  <m:r>
+                    <m:t>π</m:t>
+                  </m:r>
+                </m:e>
+              </m:d>
+              <m:r>
+                <m:t>​</m:t>
+              </m:r>
+            </m:den>
+          </m:f>
+          <m:r>
+            <m:t>  </m:t>
+          </m:r>
+          <m:r>
+            <m:rPr>
+              <m:sty m:val="p"/>
+            </m:rPr>
+            <m:t>(</m:t>
+          </m:r>
+          <m:r>
+            <m:t>19</m:t>
+          </m:r>
+          <m:r>
+            <m:rPr>
+              <m:sty m:val="p"/>
+            </m:rPr>
+            <m:t>)</m:t>
+          </m:r>
+        </m:oMath>
+      </m:oMathPara>
+      <w:bookmarkEnd w:id="52"/>
+    </w:p>
+    <w:bookmarkEnd w:id="53"/>
+    <w:p>
+      <w:pPr>
+        <w:pStyle w:val="FirstParagraph"/>
+      </w:pPr>
+      <w:r>
+        <w:rPr>
+          <w:i/>
+          <w:iCs/>
+        </w:rPr>
+        <w:t xml:space="preserve">Proof</w:t>
+      </w:r>
+      <w:r>
+        <w:t xml:space="preserve">. </w:t>
+      </w:r>
+      <w:r>
+        <w:t xml:space="preserve">This is the solution to</w:t>
       </w:r>
       <w:r>
         <w:t xml:space="preserve"> </w:t>
@@ -5960,6 +6736,73 @@
             <w:rStyle w:val="Hyperlink"/>
           </w:rPr>
           <w:t xml:space="preserve">Exercise 2</w:t>
+        </w:r>
+      </w:hyperlink>
+      <w:r>
+        <w:t xml:space="preserve">, worked in</w:t>
+      </w:r>
+      <w:r>
+        <w:t xml:space="preserve"> </w:t>
+      </w:r>
+      <w:hyperlink w:anchor="sol-ppv-bayes">
+        <w:r>
+          <w:rPr>
+            <w:rStyle w:val="Hyperlink"/>
+          </w:rPr>
+          <w:t xml:space="preserve">Solution 2</w:t>
+        </w:r>
+      </w:hyperlink>
+      <w:r>
+        <w:t xml:space="preserve">,</w:t>
+      </w:r>
+      <w:r>
+        <w:t xml:space="preserve"> </w:t>
+      </w:r>
+      <w:r>
+        <w:t xml:space="preserve">which builds on</w:t>
+      </w:r>
+      <w:r>
+        <w:t xml:space="preserve"> </w:t>
+      </w:r>
+      <w:hyperlink w:anchor="thm-prob-positive">
+        <w:r>
+          <w:rPr>
+            <w:rStyle w:val="Hyperlink"/>
+          </w:rPr>
+          <w:t xml:space="preserve">Theorem 1</w:t>
+        </w:r>
+      </w:hyperlink>
+      <w:r>
+        <w:t xml:space="preserve">.</w:t>
+      </w:r>
+    </w:p>
+    <w:bookmarkStart w:id="54" w:name="exr-ppv-ratio-form"/>
+    <w:p>
+      <w:pPr>
+        <w:pStyle w:val="BodyText"/>
+      </w:pPr>
+      <w:r>
+        <w:rPr>
+          <w:b/>
+          <w:bCs/>
+        </w:rPr>
+        <w:t xml:space="preserve">Exercise 3 (PPV in terms of two ratios)</w:t>
+      </w:r>
+      <w:r>
+        <w:t xml:space="preserve"> </w:t>
+      </w:r>
+      <w:r>
+        <w:t xml:space="preserve">Rewrite the expression for the positive predictive value from</w:t>
+      </w:r>
+      <w:r>
+        <w:t xml:space="preserve"> </w:t>
+      </w:r>
+      <w:hyperlink w:anchor="thm-ppv-bayes">
+        <w:r>
+          <w:rPr>
+            <w:rStyle w:val="Hyperlink"/>
+          </w:rPr>
+          <w:t xml:space="preserve">Theorem 2</w:t>
         </w:r>
       </w:hyperlink>
       <w:r>
@@ -6059,8 +6902,8 @@
         <w:t xml:space="preserve">of non-diseased to diseased people in the population.</w:t>
       </w:r>
     </w:p>
-    <w:bookmarkEnd w:id="50"/>
-    <w:bookmarkStart w:id="52" w:name="sol-ppv-ratio-form"/>
+    <w:bookmarkEnd w:id="54"/>
+    <w:bookmarkStart w:id="56" w:name="sol-ppv-ratio-form"/>
     <w:p>
       <w:pPr>
         <w:pStyle w:val="BodyText"/>
@@ -6232,12 +7075,12 @@
       <w:r>
         <w:t xml:space="preserve"> </w:t>
       </w:r>
-      <w:hyperlink w:anchor="exr-ppv-bayes">
+      <w:hyperlink w:anchor="thm-ppv-bayes">
         <w:r>
           <w:rPr>
             <w:rStyle w:val="Hyperlink"/>
           </w:rPr>
-          <w:t xml:space="preserve">Exercise 2</w:t>
+          <w:t xml:space="preserve">Theorem 2</w:t>
         </w:r>
       </w:hyperlink>
       <w:r>
@@ -6331,7 +7174,7 @@
       <w:pPr>
         <w:pStyle w:val="BodyText"/>
       </w:pPr>
-      <w:bookmarkStart w:id="51" w:name="eq-ppv-ratio-form-exr"/>
+      <w:bookmarkStart w:id="55" w:name="eq-ppv-ratio-form-exr"/>
       <m:oMathPara>
         <m:oMathParaPr>
           <m:jc m:val="center"/>
@@ -6925,7 +7768,7 @@
             <m:t>(</m:t>
           </m:r>
           <m:r>
-            <m:t>18</m:t>
+            <m:t>20</m:t>
           </m:r>
           <m:r>
             <m:rPr>
@@ -6935,10 +7778,10 @@
           </m:r>
         </m:oMath>
       </m:oMathPara>
-      <w:bookmarkEnd w:id="51"/>
+      <w:bookmarkEnd w:id="55"/>
     </w:p>
-    <w:bookmarkEnd w:id="52"/>
-    <w:bookmarkStart w:id="54" w:name="thm-ppv-sens-spec-prev"/>
+    <w:bookmarkEnd w:id="56"/>
+    <w:bookmarkStart w:id="58" w:name="thm-ppv-sens-spec-prev"/>
     <w:p>
       <w:pPr>
         <w:pStyle w:val="FirstParagraph"/>
@@ -6948,7 +7791,7 @@
           <w:b/>
           <w:bCs/>
         </w:rPr>
-        <w:t xml:space="preserve">Theorem 1 (PPV in terms of sensitivity, specificity, and prevalence)</w:t>
+        <w:t xml:space="preserve">Theorem 3 (PPV in terms of sensitivity, specificity, and prevalence)</w:t>
       </w:r>
       <w:r>
         <w:t xml:space="preserve"> </w:t>
@@ -7011,7 +7854,7 @@
       <w:pPr>
         <w:pStyle w:val="BodyText"/>
       </w:pPr>
-      <w:bookmarkStart w:id="53" w:name="eq-ppv-sens-spec-prev"/>
+      <w:bookmarkStart w:id="57" w:name="eq-ppv-sens-spec-prev"/>
       <m:oMathPara>
         <m:oMathParaPr>
           <m:jc m:val="center"/>
@@ -7123,7 +7966,7 @@
             <m:t>(</m:t>
           </m:r>
           <m:r>
-            <m:t>19</m:t>
+            <m:t>21</m:t>
           </m:r>
           <m:r>
             <m:rPr>
@@ -7133,9 +7976,9 @@
           </m:r>
         </m:oMath>
       </m:oMathPara>
-      <w:bookmarkEnd w:id="53"/>
+      <w:bookmarkEnd w:id="57"/>
     </w:p>
-    <w:bookmarkEnd w:id="54"/>
+    <w:bookmarkEnd w:id="58"/>
     <w:p>
       <w:pPr>
         <w:pStyle w:val="FirstParagraph"/>
@@ -7165,47 +8008,61 @@
         </w:r>
       </w:hyperlink>
       <w:r>
-        <w:t xml:space="preserve">,</w:t>
-      </w:r>
-      <w:r>
-        <w:t xml:space="preserve"> </w:t>
-      </w:r>
-      <w:r>
-        <w:t xml:space="preserve">which builds on</w:t>
-      </w:r>
-      <w:r>
-        <w:t xml:space="preserve"> </w:t>
-      </w:r>
-      <w:hyperlink w:anchor="exr-ppv-bayes">
+        <w:t xml:space="preserve">, worked in</w:t>
+      </w:r>
+      <w:r>
+        <w:t xml:space="preserve"> </w:t>
+      </w:r>
+      <w:hyperlink w:anchor="sol-ppv-ratio-form">
         <w:r>
           <w:rPr>
             <w:rStyle w:val="Hyperlink"/>
           </w:rPr>
-          <w:t xml:space="preserve">Exercise 2</w:t>
+          <w:t xml:space="preserve">Solution 3</w:t>
         </w:r>
       </w:hyperlink>
       <w:r>
-        <w:t xml:space="preserve"> </w:t>
-      </w:r>
-      <w:r>
-        <w:t xml:space="preserve">and</w:t>
-      </w:r>
-      <w:r>
-        <w:t xml:space="preserve"> </w:t>
-      </w:r>
-      <w:hyperlink w:anchor="exr-prob-positive">
+        <w:t xml:space="preserve">,</w:t>
+      </w:r>
+      <w:r>
+        <w:t xml:space="preserve"> </w:t>
+      </w:r>
+      <w:r>
+        <w:t xml:space="preserve">which builds on</w:t>
+      </w:r>
+      <w:r>
+        <w:t xml:space="preserve"> </w:t>
+      </w:r>
+      <w:hyperlink w:anchor="thm-ppv-bayes">
         <w:r>
           <w:rPr>
             <w:rStyle w:val="Hyperlink"/>
           </w:rPr>
-          <w:t xml:space="preserve">Exercise 1</w:t>
+          <w:t xml:space="preserve">Theorem 2</w:t>
         </w:r>
       </w:hyperlink>
       <w:r>
+        <w:t xml:space="preserve"> </w:t>
+      </w:r>
+      <w:r>
+        <w:t xml:space="preserve">and</w:t>
+      </w:r>
+      <w:r>
+        <w:t xml:space="preserve"> </w:t>
+      </w:r>
+      <w:hyperlink w:anchor="thm-prob-positive">
+        <w:r>
+          <w:rPr>
+            <w:rStyle w:val="Hyperlink"/>
+          </w:rPr>
+          <w:t xml:space="preserve">Theorem 1</w:t>
+        </w:r>
+      </w:hyperlink>
+      <w:r>
         <w:t xml:space="preserve">.</w:t>
       </w:r>
     </w:p>
-    <w:bookmarkStart w:id="57" w:name="exm-ppv-sens-spec-prev"/>
+    <w:bookmarkStart w:id="61" w:name="exm-ppv-sens-spec-prev"/>
     <w:p>
       <w:pPr>
         <w:pStyle w:val="BodyText"/>
@@ -7282,7 +8139,7 @@
           <w:rPr>
             <w:rStyle w:val="Hyperlink"/>
           </w:rPr>
-          <w:t xml:space="preserve">Theorem 1</w:t>
+          <w:t xml:space="preserve">Theorem 3</w:t>
         </w:r>
       </w:hyperlink>
       <w:r>
@@ -7296,7 +8153,7 @@
       <w:pPr>
         <w:pStyle w:val="BodyText"/>
       </w:pPr>
-      <w:bookmarkStart w:id="55" w:name="eq-ppv-sens-spec-prev-exm"/>
+      <w:bookmarkStart w:id="59" w:name="eq-ppv-sens-spec-prev-exm"/>
       <m:oMathPara>
         <m:oMathParaPr>
           <m:jc m:val="center"/>
@@ -7779,7 +8636,7 @@
             <m:t>(</m:t>
           </m:r>
           <m:r>
-            <m:t>20</m:t>
+            <m:t>22</m:t>
           </m:r>
           <m:r>
             <m:rPr>
@@ -7789,7 +8646,7 @@
           </m:r>
         </m:oMath>
       </m:oMathPara>
-      <w:bookmarkEnd w:id="55"/>
+      <w:bookmarkEnd w:id="59"/>
     </w:p>
     <w:p>
       <w:pPr>
@@ -7872,7 +8729,7 @@
       <w:pPr>
         <w:pStyle w:val="BodyText"/>
       </w:pPr>
-      <w:bookmarkStart w:id="56" w:name="eq-ppv-sens-spec-prev-exm-2"/>
+      <w:bookmarkStart w:id="60" w:name="eq-ppv-sens-spec-prev-exm-2"/>
       <m:oMathPara>
         <m:oMathParaPr>
           <m:jc m:val="center"/>
@@ -8137,7 +8994,7 @@
             <m:t>(</m:t>
           </m:r>
           <m:r>
-            <m:t>21</m:t>
+            <m:t>23</m:t>
           </m:r>
           <m:r>
             <m:rPr>
@@ -8147,7 +9004,7 @@
           </m:r>
         </m:oMath>
       </m:oMathPara>
-      <w:bookmarkEnd w:id="56"/>
+      <w:bookmarkEnd w:id="60"/>
     </w:p>
     <w:p>
       <w:pPr>
@@ -8157,8 +9014,8 @@
         <w:t xml:space="preserve">so about 9 in 10 positive results would be false positives.</w:t>
       </w:r>
     </w:p>
-    <w:bookmarkEnd w:id="57"/>
-    <w:bookmarkStart w:id="58" w:name="rem-ppv-prevalence"/>
+    <w:bookmarkEnd w:id="61"/>
+    <w:bookmarkStart w:id="62" w:name="rem-ppv-prevalence"/>
     <w:p>
       <w:pPr>
         <w:pStyle w:val="BodyText"/>
@@ -8237,7 +9094,7 @@
           <w:rPr>
             <w:rStyle w:val="Hyperlink"/>
           </w:rPr>
-          <w:t xml:space="preserve">Theorem 1</w:t>
+          <w:t xml:space="preserve">Theorem 3</w:t>
         </w:r>
       </w:hyperlink>
       <w:r>
@@ -8282,8 +9139,8 @@
         <w:t xml:space="preserve">shows.</w:t>
       </w:r>
     </w:p>
-    <w:bookmarkEnd w:id="58"/>
-    <w:bookmarkEnd w:id="59"/>
+    <w:bookmarkEnd w:id="62"/>
+    <w:bookmarkEnd w:id="63"/>
     <w:sectPr>
       <w:footnotePr>
         <w:numRestart w:val="eachSect"/>

</xml_diff>

<commit_message>
Deploying to gh-pages from @ Morrison-Lab/sds@9662b8e5004d826a4fee197b911498de32e30caa 🚀
</commit_message>
<xml_diff>
--- a/classification-handout.docx
+++ b/classification-handout.docx
@@ -15,10 +15,10 @@
         <w:pStyle w:val="Date"/>
       </w:pPr>
       <w:r>
-        <w:t xml:space="preserve">Last modified: 2026-10-15 08:36:30 (PDT)</w:t>
+        <w:t xml:space="preserve">Last modified: 2026-10-15 08:49:51 (PDT)</w:t>
       </w:r>
     </w:p>
-    <w:bookmarkStart w:id="16" w:name="introduction"/>
+    <w:bookmarkStart w:id="18" w:name="introduction"/>
     <w:p>
       <w:pPr>
         <w:pStyle w:val="Heading2"/>
@@ -170,7 +170,7 @@
         <w:t xml:space="preserve">.</w:t>
       </w:r>
     </w:p>
-    <w:bookmarkStart w:id="12" w:name="def-classification"/>
+    <w:bookmarkStart w:id="11" w:name="def-classification"/>
     <w:p>
       <w:pPr>
         <w:pStyle w:val="BodyText"/>
@@ -208,7 +208,64 @@
         <w:t xml:space="preserve"> </w:t>
       </w:r>
       <w:r>
-        <w:t xml:space="preserve">we seek to assign each observation to one of two or more discrete categories (</w:t>
+        <w:t xml:space="preserve">we seek to assign each observation to one of two or more discrete categories</w:t>
+      </w:r>
+      <w:r>
+        <w:t xml:space="preserve"> </w:t>
+      </w:r>
+      <w:r>
+        <w:t xml:space="preserve">based on its observed features or predictors</w:t>
+      </w:r>
+      <w:r>
+        <w:t xml:space="preserve"> </w:t>
+      </w:r>
+      <m:oMath>
+        <m:r>
+          <m:t>x</m:t>
+        </m:r>
+      </m:oMath>
+      <w:r>
+        <w:t xml:space="preserve">.</w:t>
+      </w:r>
+    </w:p>
+    <w:bookmarkEnd w:id="11"/>
+    <w:bookmarkStart w:id="12" w:name="def-class"/>
+    <w:p>
+      <w:pPr>
+        <w:pStyle w:val="BodyText"/>
+      </w:pPr>
+      <w:r>
+        <w:rPr>
+          <w:b/>
+          <w:bCs/>
+        </w:rPr>
+        <w:t xml:space="preserve">Definition 2 (Class)</w:t>
+      </w:r>
+      <w:r>
+        <w:t xml:space="preserve"> </w:t>
+      </w:r>
+      <w:r>
+        <w:t xml:space="preserve">The discrete categories of a classification problem (</w:t>
+      </w:r>
+      <w:hyperlink w:anchor="def-classification">
+        <w:r>
+          <w:rPr>
+            <w:rStyle w:val="Hyperlink"/>
+          </w:rPr>
+          <w:t xml:space="preserve">Definition 1</w:t>
+        </w:r>
+      </w:hyperlink>
+      <w:r>
+        <w:t xml:space="preserve">)</w:t>
+      </w:r>
+      <w:r>
+        <w:t xml:space="preserve"> </w:t>
+      </w:r>
+      <w:r>
+        <w:t xml:space="preserve">are its</w:t>
+      </w:r>
+      <w:r>
+        <w:t xml:space="preserve"> </w:t>
       </w:r>
       <w:r>
         <w:rPr>
@@ -218,143 +275,13 @@
         <w:t xml:space="preserve">classes</w:t>
       </w:r>
       <w:r>
-        <w:t xml:space="preserve">)</w:t>
-      </w:r>
-      <w:r>
-        <w:t xml:space="preserve"> </w:t>
-      </w:r>
-      <w:r>
-        <w:t xml:space="preserve">based on its observed features or predictors</w:t>
-      </w:r>
-      <w:r>
-        <w:t xml:space="preserve"> </w:t>
-      </w:r>
-      <m:oMath>
-        <m:r>
-          <m:t>x</m:t>
-        </m:r>
-      </m:oMath>
-      <w:r>
-        <w:t xml:space="preserve">,</w:t>
-      </w:r>
-      <w:r>
-        <w:t xml:space="preserve"> </w:t>
-      </w:r>
-      <w:r>
-        <w:t xml:space="preserve">using a</w:t>
-      </w:r>
-      <w:r>
-        <w:t xml:space="preserve"> </w:t>
-      </w:r>
-      <w:r>
-        <w:rPr>
-          <w:b/>
-          <w:bCs/>
-        </w:rPr>
-        <w:t xml:space="preserve">classification rule</w:t>
-      </w:r>
-      <w:r>
-        <w:t xml:space="preserve"> </w:t>
-      </w:r>
-      <m:oMath>
-        <m:r>
-          <m:t>c</m:t>
-        </m:r>
-      </m:oMath>
-      <w:r>
-        <w:t xml:space="preserve"> </w:t>
-      </w:r>
-      <w:r>
-        <w:t xml:space="preserve">that maps features to classes:</w:t>
-      </w:r>
-    </w:p>
-    <w:p>
-      <w:pPr>
-        <w:pStyle w:val="BodyText"/>
-      </w:pPr>
-      <w:bookmarkStart w:id="11" w:name="eq-classification"/>
-      <m:oMathPara>
-        <m:oMathParaPr>
-          <m:jc m:val="center"/>
-        </m:oMathParaPr>
-        <m:oMath>
-          <m:r>
-            <m:t>c</m:t>
-          </m:r>
-          <m:r>
-            <m:rPr>
-              <m:sty m:val="p"/>
-            </m:rPr>
-            <m:t>:</m:t>
-          </m:r>
-          <m:r>
-            <m:t>x</m:t>
-          </m:r>
-          <m:r>
-            <m:rPr>
-              <m:sty m:val="p"/>
-            </m:rPr>
-            <m:t>↦</m:t>
-          </m:r>
-          <m:r>
-            <m:t>c</m:t>
-          </m:r>
-          <m:r>
-            <m:rPr>
-              <m:sty m:val="p"/>
-            </m:rPr>
-            <m:t>(</m:t>
-          </m:r>
-          <m:r>
-            <m:t>x</m:t>
-          </m:r>
-          <m:r>
-            <m:rPr>
-              <m:sty m:val="p"/>
-            </m:rPr>
-            <m:t>)</m:t>
-          </m:r>
-          <m:r>
-            <m:rPr>
-              <m:sty m:val="p"/>
-            </m:rPr>
-            <m:t>∈</m:t>
-          </m:r>
-          <m:r>
-            <m:rPr>
-              <m:scr m:val="script"/>
-              <m:sty m:val="p"/>
-            </m:rPr>
-            <m:t>C</m:t>
-          </m:r>
-          <m:r>
-            <m:t>  </m:t>
-          </m:r>
-          <m:r>
-            <m:rPr>
-              <m:sty m:val="p"/>
-            </m:rPr>
-            <m:t>(</m:t>
-          </m:r>
-          <m:r>
-            <m:t>1</m:t>
-          </m:r>
-          <m:r>
-            <m:rPr>
-              <m:sty m:val="p"/>
-            </m:rPr>
-            <m:t>)</m:t>
-          </m:r>
-        </m:oMath>
-      </m:oMathPara>
-      <w:bookmarkEnd w:id="11"/>
-    </w:p>
-    <w:p>
-      <w:pPr>
-        <w:pStyle w:val="FirstParagraph"/>
-      </w:pPr>
-      <w:r>
-        <w:t xml:space="preserve">where</w:t>
+        <w:t xml:space="preserve">.</w:t>
+      </w:r>
+      <w:r>
+        <w:t xml:space="preserve"> </w:t>
+      </w:r>
+      <w:r>
+        <w:t xml:space="preserve">Let</w:t>
       </w:r>
       <w:r>
         <w:t xml:space="preserve"> </w:t>
@@ -372,7 +299,7 @@
         <w:t xml:space="preserve"> </w:t>
       </w:r>
       <w:r>
-        <w:t xml:space="preserve">is a set of</w:t>
+        <w:t xml:space="preserve">be a set of</w:t>
       </w:r>
       <w:r>
         <w:t xml:space="preserve"> </w:t>
@@ -463,10 +390,152 @@
       </w:r>
     </w:p>
     <w:bookmarkEnd w:id="12"/>
-    <w:bookmarkStart w:id="14" w:name="exm-classification"/>
+    <w:bookmarkStart w:id="14" w:name="def-classification-rule"/>
     <w:p>
       <w:pPr>
         <w:pStyle w:val="BodyText"/>
+      </w:pPr>
+      <w:r>
+        <w:rPr>
+          <w:b/>
+          <w:bCs/>
+        </w:rPr>
+        <w:t xml:space="preserve">Definition 3 (Classification rule)</w:t>
+      </w:r>
+      <w:r>
+        <w:t xml:space="preserve"> </w:t>
+      </w:r>
+      <w:r>
+        <w:t xml:space="preserve">A</w:t>
+      </w:r>
+      <w:r>
+        <w:t xml:space="preserve"> </w:t>
+      </w:r>
+      <w:r>
+        <w:rPr>
+          <w:b/>
+          <w:bCs/>
+        </w:rPr>
+        <w:t xml:space="preserve">classification rule</w:t>
+      </w:r>
+      <w:r>
+        <w:t xml:space="preserve"> </w:t>
+      </w:r>
+      <m:oMath>
+        <m:r>
+          <m:t>c</m:t>
+        </m:r>
+      </m:oMath>
+      <w:r>
+        <w:t xml:space="preserve"> </w:t>
+      </w:r>
+      <w:r>
+        <w:t xml:space="preserve">maps features to classes</w:t>
+      </w:r>
+      <w:r>
+        <w:t xml:space="preserve"> </w:t>
+      </w:r>
+      <w:r>
+        <w:t xml:space="preserve">(</w:t>
+      </w:r>
+      <w:hyperlink w:anchor="def-class">
+        <w:r>
+          <w:rPr>
+            <w:rStyle w:val="Hyperlink"/>
+          </w:rPr>
+          <w:t xml:space="preserve">Definition 2</w:t>
+        </w:r>
+      </w:hyperlink>
+      <w:r>
+        <w:t xml:space="preserve">):</w:t>
+      </w:r>
+    </w:p>
+    <w:p>
+      <w:pPr>
+        <w:pStyle w:val="BodyText"/>
+      </w:pPr>
+      <w:bookmarkStart w:id="13" w:name="eq-classification"/>
+      <m:oMathPara>
+        <m:oMathParaPr>
+          <m:jc m:val="center"/>
+        </m:oMathParaPr>
+        <m:oMath>
+          <m:r>
+            <m:t>c</m:t>
+          </m:r>
+          <m:r>
+            <m:rPr>
+              <m:sty m:val="p"/>
+            </m:rPr>
+            <m:t>:</m:t>
+          </m:r>
+          <m:r>
+            <m:t>x</m:t>
+          </m:r>
+          <m:r>
+            <m:rPr>
+              <m:sty m:val="p"/>
+            </m:rPr>
+            <m:t>↦</m:t>
+          </m:r>
+          <m:r>
+            <m:t>c</m:t>
+          </m:r>
+          <m:r>
+            <m:rPr>
+              <m:sty m:val="p"/>
+            </m:rPr>
+            <m:t>(</m:t>
+          </m:r>
+          <m:r>
+            <m:t>x</m:t>
+          </m:r>
+          <m:r>
+            <m:rPr>
+              <m:sty m:val="p"/>
+            </m:rPr>
+            <m:t>)</m:t>
+          </m:r>
+          <m:r>
+            <m:rPr>
+              <m:sty m:val="p"/>
+            </m:rPr>
+            <m:t>∈</m:t>
+          </m:r>
+          <m:r>
+            <m:rPr>
+              <m:scr m:val="script"/>
+              <m:sty m:val="p"/>
+            </m:rPr>
+            <m:t>C</m:t>
+          </m:r>
+          <m:r>
+            <m:t>  </m:t>
+          </m:r>
+          <m:r>
+            <m:rPr>
+              <m:sty m:val="p"/>
+            </m:rPr>
+            <m:t>(</m:t>
+          </m:r>
+          <m:r>
+            <m:t>1</m:t>
+          </m:r>
+          <m:r>
+            <m:rPr>
+              <m:sty m:val="p"/>
+            </m:rPr>
+            <m:t>)</m:t>
+          </m:r>
+        </m:oMath>
+      </m:oMathPara>
+      <w:bookmarkEnd w:id="13"/>
+    </w:p>
+    <w:bookmarkEnd w:id="14"/>
+    <w:bookmarkStart w:id="16" w:name="exm-classification"/>
+    <w:p>
+      <w:pPr>
+        <w:pStyle w:val="FirstParagraph"/>
       </w:pPr>
       <w:r>
         <w:rPr>
@@ -594,12 +663,12 @@
       <w:r>
         <w:t xml:space="preserve">(</w:t>
       </w:r>
-      <w:hyperlink w:anchor="def-classification">
+      <w:hyperlink w:anchor="def-classification-rule">
         <w:r>
           <w:rPr>
             <w:rStyle w:val="Hyperlink"/>
           </w:rPr>
-          <w:t xml:space="preserve">Definition 1</w:t>
+          <w:t xml:space="preserve">Definition 3</w:t>
         </w:r>
       </w:hyperlink>
       <w:r>
@@ -637,7 +706,7 @@
       <w:pPr>
         <w:pStyle w:val="BodyText"/>
       </w:pPr>
-      <w:bookmarkStart w:id="13" w:name="eq-classification-exm"/>
+      <w:bookmarkStart w:id="15" w:name="eq-classification-exm"/>
       <m:oMathPara>
         <m:oMathParaPr>
           <m:jc m:val="center"/>
@@ -806,10 +875,10 @@
           </m:r>
         </m:oMath>
       </m:oMathPara>
-      <w:bookmarkEnd w:id="13"/>
+      <w:bookmarkEnd w:id="15"/>
     </w:p>
-    <w:bookmarkEnd w:id="14"/>
-    <w:bookmarkStart w:id="15" w:name="rem-classification-binary-labels"/>
+    <w:bookmarkEnd w:id="16"/>
+    <w:bookmarkStart w:id="17" w:name="rem-classification-binary-labels"/>
     <w:p>
       <w:pPr>
         <w:pStyle w:val="FirstParagraph"/>
@@ -899,9 +968,9 @@
         <w:t xml:space="preserve">.</w:t>
       </w:r>
     </w:p>
-    <w:bookmarkEnd w:id="15"/>
-    <w:bookmarkEnd w:id="16"/>
-    <w:bookmarkStart w:id="32" w:name="diagnostic-test-characteristics"/>
+    <w:bookmarkEnd w:id="17"/>
+    <w:bookmarkEnd w:id="18"/>
+    <w:bookmarkStart w:id="34" w:name="diagnostic-test-characteristics"/>
     <w:p>
       <w:pPr>
         <w:pStyle w:val="Heading2"/>
@@ -910,7 +979,7 @@
         <w:t xml:space="preserve">2 Diagnostic test characteristics</w:t>
       </w:r>
     </w:p>
-    <w:bookmarkStart w:id="18" w:name="def-sensitivity"/>
+    <w:bookmarkStart w:id="20" w:name="def-sensitivity"/>
     <w:p>
       <w:pPr>
         <w:pStyle w:val="FirstParagraph"/>
@@ -920,7 +989,7 @@
           <w:b/>
           <w:bCs/>
         </w:rPr>
-        <w:t xml:space="preserve">Definition 2 (Sensitivity)</w:t>
+        <w:t xml:space="preserve">Definition 4 (Sensitivity)</w:t>
       </w:r>
       <w:r>
         <w:t xml:space="preserve"> </w:t>
@@ -980,7 +1049,7 @@
       <w:pPr>
         <w:pStyle w:val="BodyText"/>
       </w:pPr>
-      <w:bookmarkStart w:id="17" w:name="eq-sensitivity"/>
+      <w:bookmarkStart w:id="19" w:name="eq-sensitivity"/>
       <m:oMathPara>
         <m:oMathParaPr>
           <m:jc m:val="center"/>
@@ -1065,10 +1134,10 @@
           </m:r>
         </m:oMath>
       </m:oMathPara>
-      <w:bookmarkEnd w:id="17"/>
+      <w:bookmarkEnd w:id="19"/>
     </w:p>
-    <w:bookmarkEnd w:id="18"/>
-    <w:bookmarkStart w:id="20" w:name="exm-sensitivity"/>
+    <w:bookmarkEnd w:id="20"/>
+    <w:bookmarkStart w:id="22" w:name="exm-sensitivity"/>
     <w:p>
       <w:pPr>
         <w:pStyle w:val="FirstParagraph"/>
@@ -1155,7 +1224,7 @@
           <w:rPr>
             <w:rStyle w:val="Hyperlink"/>
           </w:rPr>
-          <w:t xml:space="preserve">Definition 2</w:t>
+          <w:t xml:space="preserve">Definition 4</w:t>
         </w:r>
       </w:hyperlink>
       <w:r>
@@ -1166,7 +1235,7 @@
       <w:pPr>
         <w:pStyle w:val="BodyText"/>
       </w:pPr>
-      <w:bookmarkStart w:id="19" w:name="eq-sensitivity-exm"/>
+      <w:bookmarkStart w:id="21" w:name="eq-sensitivity-exm"/>
       <m:oMathPara>
         <m:oMathParaPr>
           <m:jc m:val="center"/>
@@ -1234,10 +1303,10 @@
           </m:r>
         </m:oMath>
       </m:oMathPara>
-      <w:bookmarkEnd w:id="19"/>
+      <w:bookmarkEnd w:id="21"/>
     </w:p>
-    <w:bookmarkEnd w:id="20"/>
-    <w:bookmarkStart w:id="22" w:name="def-specificity"/>
+    <w:bookmarkEnd w:id="22"/>
+    <w:bookmarkStart w:id="24" w:name="def-specificity"/>
     <w:p>
       <w:pPr>
         <w:pStyle w:val="FirstParagraph"/>
@@ -1247,7 +1316,7 @@
           <w:b/>
           <w:bCs/>
         </w:rPr>
-        <w:t xml:space="preserve">Definition 3 (Specificity)</w:t>
+        <w:t xml:space="preserve">Definition 5 (Specificity)</w:t>
       </w:r>
       <w:r>
         <w:t xml:space="preserve"> </w:t>
@@ -1319,7 +1388,7 @@
       <w:pPr>
         <w:pStyle w:val="BodyText"/>
       </w:pPr>
-      <w:bookmarkStart w:id="21" w:name="eq-specificity"/>
+      <w:bookmarkStart w:id="23" w:name="eq-specificity"/>
       <m:oMathPara>
         <m:oMathParaPr>
           <m:jc m:val="center"/>
@@ -1416,10 +1485,10 @@
           </m:r>
         </m:oMath>
       </m:oMathPara>
-      <w:bookmarkEnd w:id="21"/>
+      <w:bookmarkEnd w:id="23"/>
     </w:p>
-    <w:bookmarkEnd w:id="22"/>
-    <w:bookmarkStart w:id="26" w:name="exm-specificity"/>
+    <w:bookmarkEnd w:id="24"/>
+    <w:bookmarkStart w:id="28" w:name="exm-specificity"/>
     <w:p>
       <w:pPr>
         <w:pStyle w:val="FirstParagraph"/>
@@ -1465,7 +1534,7 @@
           <w:rPr>
             <w:rStyle w:val="Hyperlink"/>
           </w:rPr>
-          <w:t xml:space="preserve">Definition 3</w:t>
+          <w:t xml:space="preserve">Definition 5</w:t>
         </w:r>
       </w:hyperlink>
       <w:r>
@@ -1476,7 +1545,7 @@
       <w:pPr>
         <w:pStyle w:val="BodyText"/>
       </w:pPr>
-      <w:bookmarkStart w:id="23" w:name="eq-specificity-exm"/>
+      <w:bookmarkStart w:id="25" w:name="eq-specificity-exm"/>
       <m:oMathPara>
         <m:oMathParaPr>
           <m:jc m:val="center"/>
@@ -1556,7 +1625,7 @@
           </m:r>
         </m:oMath>
       </m:oMathPara>
-      <w:bookmarkEnd w:id="23"/>
+      <w:bookmarkEnd w:id="25"/>
     </w:p>
     <w:p>
       <w:pPr>
@@ -1568,7 +1637,7 @@
       <w:r>
         <w:t xml:space="preserve"> </w:t>
       </w:r>
-      <w:hyperlink r:id="rId24">
+      <w:hyperlink r:id="rId26">
         <w:r>
           <w:rPr>
             <w:rStyle w:val="Hyperlink"/>
@@ -1590,7 +1659,7 @@
       <w:pPr>
         <w:pStyle w:val="BodyText"/>
       </w:pPr>
-      <w:bookmarkStart w:id="25" w:name="eq-specificity-exm-2"/>
+      <w:bookmarkStart w:id="27" w:name="eq-specificity-exm-2"/>
       <m:oMathPara>
         <m:oMathParaPr>
           <m:jc m:val="center"/>
@@ -1814,10 +1883,10 @@
           </m:r>
         </m:oMath>
       </m:oMathPara>
-      <w:bookmarkEnd w:id="25"/>
+      <w:bookmarkEnd w:id="27"/>
     </w:p>
-    <w:bookmarkEnd w:id="26"/>
-    <w:bookmarkStart w:id="28" w:name="def-prevalence"/>
+    <w:bookmarkEnd w:id="28"/>
+    <w:bookmarkStart w:id="30" w:name="def-prevalence"/>
     <w:p>
       <w:pPr>
         <w:pStyle w:val="FirstParagraph"/>
@@ -1827,7 +1896,7 @@
           <w:b/>
           <w:bCs/>
         </w:rPr>
-        <w:t xml:space="preserve">Definition 4 (Prevalence)</w:t>
+        <w:t xml:space="preserve">Definition 6 (Prevalence)</w:t>
       </w:r>
       <w:r>
         <w:t xml:space="preserve"> </w:t>
@@ -1876,7 +1945,7 @@
       <w:pPr>
         <w:pStyle w:val="BodyText"/>
       </w:pPr>
-      <w:bookmarkStart w:id="27" w:name="eq-prevalence"/>
+      <w:bookmarkStart w:id="29" w:name="eq-prevalence"/>
       <m:oMathPara>
         <m:oMathParaPr>
           <m:jc m:val="center"/>
@@ -1949,10 +2018,10 @@
           </m:r>
         </m:oMath>
       </m:oMathPara>
-      <w:bookmarkEnd w:id="27"/>
+      <w:bookmarkEnd w:id="29"/>
     </w:p>
-    <w:bookmarkEnd w:id="28"/>
-    <w:bookmarkStart w:id="31" w:name="exm-prevalence"/>
+    <w:bookmarkEnd w:id="30"/>
+    <w:bookmarkStart w:id="33" w:name="exm-prevalence"/>
     <w:p>
       <w:pPr>
         <w:pStyle w:val="FirstParagraph"/>
@@ -1998,7 +2067,7 @@
           <w:rPr>
             <w:rStyle w:val="Hyperlink"/>
           </w:rPr>
-          <w:t xml:space="preserve">Definition 4</w:t>
+          <w:t xml:space="preserve">Definition 6</w:t>
         </w:r>
       </w:hyperlink>
       <w:r>
@@ -2009,7 +2078,7 @@
       <w:pPr>
         <w:pStyle w:val="BodyText"/>
       </w:pPr>
-      <w:bookmarkStart w:id="29" w:name="eq-prevalence-exm"/>
+      <w:bookmarkStart w:id="31" w:name="eq-prevalence-exm"/>
       <m:oMathPara>
         <m:oMathParaPr>
           <m:jc m:val="center"/>
@@ -2065,7 +2134,7 @@
           </m:r>
         </m:oMath>
       </m:oMathPara>
-      <w:bookmarkEnd w:id="29"/>
+      <w:bookmarkEnd w:id="31"/>
     </w:p>
     <w:p>
       <w:pPr>
@@ -2077,7 +2146,7 @@
       <w:r>
         <w:t xml:space="preserve"> </w:t>
       </w:r>
-      <w:hyperlink r:id="rId24">
+      <w:hyperlink r:id="rId26">
         <w:r>
           <w:rPr>
             <w:rStyle w:val="Hyperlink"/>
@@ -2099,7 +2168,7 @@
       <w:pPr>
         <w:pStyle w:val="BodyText"/>
       </w:pPr>
-      <w:bookmarkStart w:id="30" w:name="eq-prevalence-exm-2"/>
+      <w:bookmarkStart w:id="32" w:name="eq-prevalence-exm-2"/>
       <m:oMathPara>
         <m:oMathParaPr>
           <m:jc m:val="center"/>
@@ -2271,11 +2340,11 @@
           </m:r>
         </m:oMath>
       </m:oMathPara>
-      <w:bookmarkEnd w:id="30"/>
+      <w:bookmarkEnd w:id="32"/>
     </w:p>
-    <w:bookmarkEnd w:id="31"/>
-    <w:bookmarkEnd w:id="32"/>
-    <w:bookmarkStart w:id="43" w:name="predictive-values"/>
+    <w:bookmarkEnd w:id="33"/>
+    <w:bookmarkEnd w:id="34"/>
+    <w:bookmarkStart w:id="45" w:name="predictive-values"/>
     <w:p>
       <w:pPr>
         <w:pStyle w:val="Heading2"/>
@@ -2284,7 +2353,7 @@
         <w:t xml:space="preserve">3 Predictive values</w:t>
       </w:r>
     </w:p>
-    <w:bookmarkStart w:id="34" w:name="def-ppv"/>
+    <w:bookmarkStart w:id="36" w:name="def-ppv"/>
     <w:p>
       <w:pPr>
         <w:pStyle w:val="FirstParagraph"/>
@@ -2294,7 +2363,7 @@
           <w:b/>
           <w:bCs/>
         </w:rPr>
-        <w:t xml:space="preserve">Definition 5 (Positive predictive value (PPV))</w:t>
+        <w:t xml:space="preserve">Definition 7 (Positive predictive value (PPV))</w:t>
       </w:r>
       <w:r>
         <w:t xml:space="preserve"> </w:t>
@@ -2354,7 +2423,7 @@
       <w:pPr>
         <w:pStyle w:val="BodyText"/>
       </w:pPr>
-      <w:bookmarkStart w:id="33" w:name="eq-ppv"/>
+      <w:bookmarkStart w:id="35" w:name="eq-ppv"/>
       <m:oMathPara>
         <m:oMathParaPr>
           <m:jc m:val="center"/>
@@ -2439,10 +2508,10 @@
           </m:r>
         </m:oMath>
       </m:oMathPara>
-      <w:bookmarkEnd w:id="33"/>
+      <w:bookmarkEnd w:id="35"/>
     </w:p>
-    <w:bookmarkEnd w:id="34"/>
-    <w:bookmarkStart w:id="37" w:name="exm-ppv"/>
+    <w:bookmarkEnd w:id="36"/>
+    <w:bookmarkStart w:id="39" w:name="exm-ppv"/>
     <w:p>
       <w:pPr>
         <w:pStyle w:val="FirstParagraph"/>
@@ -2514,7 +2583,7 @@
       <w:r>
         <w:t xml:space="preserve"> </w:t>
       </w:r>
-      <w:hyperlink r:id="rId35">
+      <w:hyperlink r:id="rId37">
         <w:r>
           <w:rPr>
             <w:rStyle w:val="Hyperlink"/>
@@ -2533,7 +2602,7 @@
           <w:rPr>
             <w:rStyle w:val="Hyperlink"/>
           </w:rPr>
-          <w:t xml:space="preserve">Definition 5</w:t>
+          <w:t xml:space="preserve">Definition 7</w:t>
         </w:r>
       </w:hyperlink>
       <w:r>
@@ -2544,7 +2613,7 @@
       <w:pPr>
         <w:pStyle w:val="BodyText"/>
       </w:pPr>
-      <w:bookmarkStart w:id="36" w:name="eq-ppv-exm"/>
+      <w:bookmarkStart w:id="38" w:name="eq-ppv-exm"/>
       <m:oMathPara>
         <m:oMathParaPr>
           <m:jc m:val="center"/>
@@ -2612,7 +2681,7 @@
           </m:r>
         </m:oMath>
       </m:oMathPara>
-      <w:bookmarkEnd w:id="36"/>
+      <w:bookmarkEnd w:id="38"/>
     </w:p>
     <w:p>
       <w:pPr>
@@ -2640,8 +2709,8 @@
         <w:t xml:space="preserve">false positives make up a meaningful fraction of all positive tests.</w:t>
       </w:r>
     </w:p>
-    <w:bookmarkEnd w:id="37"/>
-    <w:bookmarkStart w:id="39" w:name="def-npv"/>
+    <w:bookmarkEnd w:id="39"/>
+    <w:bookmarkStart w:id="41" w:name="def-npv"/>
     <w:p>
       <w:pPr>
         <w:pStyle w:val="BodyText"/>
@@ -2651,7 +2720,7 @@
           <w:b/>
           <w:bCs/>
         </w:rPr>
-        <w:t xml:space="preserve">Definition 6 (Negative predictive value (NPV))</w:t>
+        <w:t xml:space="preserve">Definition 8 (Negative predictive value (NPV))</w:t>
       </w:r>
       <w:r>
         <w:t xml:space="preserve"> </w:t>
@@ -2723,7 +2792,7 @@
       <w:pPr>
         <w:pStyle w:val="BodyText"/>
       </w:pPr>
-      <w:bookmarkStart w:id="38" w:name="eq-npv"/>
+      <w:bookmarkStart w:id="40" w:name="eq-npv"/>
       <m:oMathPara>
         <m:oMathParaPr>
           <m:jc m:val="center"/>
@@ -2820,10 +2889,10 @@
           </m:r>
         </m:oMath>
       </m:oMathPara>
-      <w:bookmarkEnd w:id="38"/>
+      <w:bookmarkEnd w:id="40"/>
     </w:p>
-    <w:bookmarkEnd w:id="39"/>
-    <w:bookmarkStart w:id="42" w:name="exm-npv"/>
+    <w:bookmarkEnd w:id="41"/>
+    <w:bookmarkStart w:id="44" w:name="exm-npv"/>
     <w:p>
       <w:pPr>
         <w:pStyle w:val="FirstParagraph"/>
@@ -2907,7 +2976,7 @@
       <w:r>
         <w:t xml:space="preserve"> </w:t>
       </w:r>
-      <w:hyperlink r:id="rId24">
+      <w:hyperlink r:id="rId26">
         <w:r>
           <w:rPr>
             <w:rStyle w:val="Hyperlink"/>
@@ -2923,7 +2992,7 @@
       <w:pPr>
         <w:pStyle w:val="BodyText"/>
       </w:pPr>
-      <w:bookmarkStart w:id="40" w:name="eq-npv-exm"/>
+      <w:bookmarkStart w:id="42" w:name="eq-npv-exm"/>
       <m:oMathPara>
         <m:oMathParaPr>
           <m:jc m:val="center"/>
@@ -3129,7 +3198,7 @@
           </m:r>
         </m:oMath>
       </m:oMathPara>
-      <w:bookmarkEnd w:id="40"/>
+      <w:bookmarkEnd w:id="42"/>
     </w:p>
     <w:p>
       <w:pPr>
@@ -3228,7 +3297,7 @@
           <w:rPr>
             <w:rStyle w:val="Hyperlink"/>
           </w:rPr>
-          <w:t xml:space="preserve">Definition 6</w:t>
+          <w:t xml:space="preserve">Definition 8</w:t>
         </w:r>
       </w:hyperlink>
       <w:r>
@@ -3239,7 +3308,7 @@
       <w:pPr>
         <w:pStyle w:val="BodyText"/>
       </w:pPr>
-      <w:bookmarkStart w:id="41" w:name="eq-npv-exm-2"/>
+      <w:bookmarkStart w:id="43" w:name="eq-npv-exm-2"/>
       <m:oMathPara>
         <m:oMathParaPr>
           <m:jc m:val="center"/>
@@ -3903,7 +3972,7 @@
           </m:r>
         </m:oMath>
       </m:oMathPara>
-      <w:bookmarkEnd w:id="41"/>
+      <w:bookmarkEnd w:id="43"/>
     </w:p>
     <w:p>
       <w:pPr>
@@ -3919,9 +3988,9 @@
         <w:t xml:space="preserve">only about 8 in 10,000 people who test negative have COVID-19.</w:t>
       </w:r>
     </w:p>
-    <w:bookmarkEnd w:id="42"/>
-    <w:bookmarkEnd w:id="43"/>
-    <w:bookmarkStart w:id="63" w:name="X076ffac91629c23ab63ea48ae4a49dc44f38759"/>
+    <w:bookmarkEnd w:id="44"/>
+    <w:bookmarkEnd w:id="45"/>
+    <w:bookmarkStart w:id="65" w:name="X076ffac91629c23ab63ea48ae4a49dc44f38759"/>
     <w:p>
       <w:pPr>
         <w:pStyle w:val="Heading2"/>
@@ -3930,7 +3999,7 @@
         <w:t xml:space="preserve">4 PPV in terms of sensitivity, specificity, and prevalence</w:t>
       </w:r>
     </w:p>
-    <w:bookmarkStart w:id="44" w:name="exr-prob-positive"/>
+    <w:bookmarkStart w:id="46" w:name="exr-prob-positive"/>
     <w:p>
       <w:pPr>
         <w:pStyle w:val="FirstParagraph"/>
@@ -4071,8 +4140,8 @@
         <w:t xml:space="preserve">of the disease.</w:t>
       </w:r>
     </w:p>
-    <w:bookmarkEnd w:id="44"/>
-    <w:bookmarkStart w:id="46" w:name="sol-prob-positive"/>
+    <w:bookmarkEnd w:id="46"/>
+    <w:bookmarkStart w:id="48" w:name="sol-prob-positive"/>
     <w:p>
       <w:pPr>
         <w:pStyle w:val="FirstParagraph"/>
@@ -4154,7 +4223,7 @@
       <w:pPr>
         <w:pStyle w:val="BodyText"/>
       </w:pPr>
-      <w:bookmarkStart w:id="45" w:name="eq-prob-positive-exr"/>
+      <w:bookmarkStart w:id="47" w:name="eq-prob-positive-exr"/>
       <m:oMathPara>
         <m:oMathParaPr>
           <m:jc m:val="center"/>
@@ -5164,10 +5233,10 @@
           </m:r>
         </m:oMath>
       </m:oMathPara>
-      <w:bookmarkEnd w:id="45"/>
+      <w:bookmarkEnd w:id="47"/>
     </w:p>
-    <w:bookmarkEnd w:id="46"/>
-    <w:bookmarkStart w:id="48" w:name="thm-prob-positive"/>
+    <w:bookmarkEnd w:id="48"/>
+    <w:bookmarkStart w:id="50" w:name="thm-prob-positive"/>
     <w:p>
       <w:pPr>
         <w:pStyle w:val="FirstParagraph"/>
@@ -5335,7 +5404,7 @@
       <w:pPr>
         <w:pStyle w:val="BodyText"/>
       </w:pPr>
-      <w:bookmarkStart w:id="47" w:name="eq-prob-positive"/>
+      <w:bookmarkStart w:id="49" w:name="eq-prob-positive"/>
       <m:oMathPara>
         <m:oMathParaPr>
           <m:jc m:val="center"/>
@@ -5479,9 +5548,9 @@
           </m:r>
         </m:oMath>
       </m:oMathPara>
-      <w:bookmarkEnd w:id="47"/>
+      <w:bookmarkEnd w:id="49"/>
     </w:p>
-    <w:bookmarkEnd w:id="48"/>
+    <w:bookmarkEnd w:id="50"/>
     <w:p>
       <w:pPr>
         <w:pStyle w:val="FirstParagraph"/>
@@ -5528,7 +5597,7 @@
         <w:t xml:space="preserve">.</w:t>
       </w:r>
     </w:p>
-    <w:bookmarkStart w:id="49" w:name="exr-ppv-bayes"/>
+    <w:bookmarkStart w:id="51" w:name="exr-ppv-bayes"/>
     <w:p>
       <w:pPr>
         <w:pStyle w:val="BodyText"/>
@@ -5651,8 +5720,8 @@
         <w:t xml:space="preserve">of the disease.</w:t>
       </w:r>
     </w:p>
-    <w:bookmarkEnd w:id="49"/>
-    <w:bookmarkStart w:id="51" w:name="sol-ppv-bayes"/>
+    <w:bookmarkEnd w:id="51"/>
+    <w:bookmarkStart w:id="53" w:name="sol-ppv-bayes"/>
     <w:p>
       <w:pPr>
         <w:pStyle w:val="FirstParagraph"/>
@@ -5768,7 +5837,7 @@
       <w:pPr>
         <w:pStyle w:val="BodyText"/>
       </w:pPr>
-      <w:bookmarkStart w:id="50" w:name="eq-ppv-bayes-exr"/>
+      <w:bookmarkStart w:id="52" w:name="eq-ppv-bayes-exr"/>
       <m:oMathPara>
         <m:oMathParaPr>
           <m:jc m:val="center"/>
@@ -6291,10 +6360,10 @@
           </m:r>
         </m:oMath>
       </m:oMathPara>
-      <w:bookmarkEnd w:id="50"/>
+      <w:bookmarkEnd w:id="52"/>
     </w:p>
-    <w:bookmarkEnd w:id="51"/>
-    <w:bookmarkStart w:id="53" w:name="thm-ppv-bayes"/>
+    <w:bookmarkEnd w:id="53"/>
+    <w:bookmarkStart w:id="55" w:name="thm-ppv-bayes"/>
     <w:p>
       <w:pPr>
         <w:pStyle w:val="FirstParagraph"/>
@@ -6555,7 +6624,7 @@
       <w:pPr>
         <w:pStyle w:val="BodyText"/>
       </w:pPr>
-      <w:bookmarkStart w:id="52" w:name="eq-ppv-bayes"/>
+      <w:bookmarkStart w:id="54" w:name="eq-ppv-bayes"/>
       <m:oMathPara>
         <m:oMathParaPr>
           <m:jc m:val="center"/>
@@ -6707,9 +6776,9 @@
           </m:r>
         </m:oMath>
       </m:oMathPara>
-      <w:bookmarkEnd w:id="52"/>
+      <w:bookmarkEnd w:id="54"/>
     </w:p>
-    <w:bookmarkEnd w:id="53"/>
+    <w:bookmarkEnd w:id="55"/>
     <w:p>
       <w:pPr>
         <w:pStyle w:val="FirstParagraph"/>
@@ -6776,7 +6845,7 @@
         <w:t xml:space="preserve">.</w:t>
       </w:r>
     </w:p>
-    <w:bookmarkStart w:id="54" w:name="exr-ppv-ratio-form"/>
+    <w:bookmarkStart w:id="56" w:name="exr-ppv-ratio-form"/>
     <w:p>
       <w:pPr>
         <w:pStyle w:val="BodyText"/>
@@ -6902,8 +6971,8 @@
         <w:t xml:space="preserve">of non-diseased to diseased people in the population.</w:t>
       </w:r>
     </w:p>
-    <w:bookmarkEnd w:id="54"/>
-    <w:bookmarkStart w:id="56" w:name="sol-ppv-ratio-form"/>
+    <w:bookmarkEnd w:id="56"/>
+    <w:bookmarkStart w:id="58" w:name="sol-ppv-ratio-form"/>
     <w:p>
       <w:pPr>
         <w:pStyle w:val="BodyText"/>
@@ -7174,7 +7243,7 @@
       <w:pPr>
         <w:pStyle w:val="BodyText"/>
       </w:pPr>
-      <w:bookmarkStart w:id="55" w:name="eq-ppv-ratio-form-exr"/>
+      <w:bookmarkStart w:id="57" w:name="eq-ppv-ratio-form-exr"/>
       <m:oMathPara>
         <m:oMathParaPr>
           <m:jc m:val="center"/>
@@ -7778,10 +7847,10 @@
           </m:r>
         </m:oMath>
       </m:oMathPara>
-      <w:bookmarkEnd w:id="55"/>
+      <w:bookmarkEnd w:id="57"/>
     </w:p>
-    <w:bookmarkEnd w:id="56"/>
-    <w:bookmarkStart w:id="58" w:name="thm-ppv-sens-spec-prev"/>
+    <w:bookmarkEnd w:id="58"/>
+    <w:bookmarkStart w:id="60" w:name="thm-ppv-sens-spec-prev"/>
     <w:p>
       <w:pPr>
         <w:pStyle w:val="FirstParagraph"/>
@@ -7854,7 +7923,7 @@
       <w:pPr>
         <w:pStyle w:val="BodyText"/>
       </w:pPr>
-      <w:bookmarkStart w:id="57" w:name="eq-ppv-sens-spec-prev"/>
+      <w:bookmarkStart w:id="59" w:name="eq-ppv-sens-spec-prev"/>
       <m:oMathPara>
         <m:oMathParaPr>
           <m:jc m:val="center"/>
@@ -7976,9 +8045,9 @@
           </m:r>
         </m:oMath>
       </m:oMathPara>
-      <w:bookmarkEnd w:id="57"/>
+      <w:bookmarkEnd w:id="59"/>
     </w:p>
-    <w:bookmarkEnd w:id="58"/>
+    <w:bookmarkEnd w:id="60"/>
     <w:p>
       <w:pPr>
         <w:pStyle w:val="FirstParagraph"/>
@@ -8062,7 +8131,7 @@
         <w:t xml:space="preserve">.</w:t>
       </w:r>
     </w:p>
-    <w:bookmarkStart w:id="61" w:name="exm-ppv-sens-spec-prev"/>
+    <w:bookmarkStart w:id="63" w:name="exm-ppv-sens-spec-prev"/>
     <w:p>
       <w:pPr>
         <w:pStyle w:val="BodyText"/>
@@ -8153,7 +8222,7 @@
       <w:pPr>
         <w:pStyle w:val="BodyText"/>
       </w:pPr>
-      <w:bookmarkStart w:id="59" w:name="eq-ppv-sens-spec-prev-exm"/>
+      <w:bookmarkStart w:id="61" w:name="eq-ppv-sens-spec-prev-exm"/>
       <m:oMathPara>
         <m:oMathParaPr>
           <m:jc m:val="center"/>
@@ -8646,7 +8715,7 @@
           </m:r>
         </m:oMath>
       </m:oMathPara>
-      <w:bookmarkEnd w:id="59"/>
+      <w:bookmarkEnd w:id="61"/>
     </w:p>
     <w:p>
       <w:pPr>
@@ -8729,7 +8798,7 @@
       <w:pPr>
         <w:pStyle w:val="BodyText"/>
       </w:pPr>
-      <w:bookmarkStart w:id="60" w:name="eq-ppv-sens-spec-prev-exm-2"/>
+      <w:bookmarkStart w:id="62" w:name="eq-ppv-sens-spec-prev-exm-2"/>
       <m:oMathPara>
         <m:oMathParaPr>
           <m:jc m:val="center"/>
@@ -9004,7 +9073,7 @@
           </m:r>
         </m:oMath>
       </m:oMathPara>
-      <w:bookmarkEnd w:id="60"/>
+      <w:bookmarkEnd w:id="62"/>
     </w:p>
     <w:p>
       <w:pPr>
@@ -9014,8 +9083,8 @@
         <w:t xml:space="preserve">so about 9 in 10 positive results would be false positives.</w:t>
       </w:r>
     </w:p>
-    <w:bookmarkEnd w:id="61"/>
-    <w:bookmarkStart w:id="62" w:name="rem-ppv-prevalence"/>
+    <w:bookmarkEnd w:id="63"/>
+    <w:bookmarkStart w:id="64" w:name="rem-ppv-prevalence"/>
     <w:p>
       <w:pPr>
         <w:pStyle w:val="BodyText"/>
@@ -9139,8 +9208,8 @@
         <w:t xml:space="preserve">shows.</w:t>
       </w:r>
     </w:p>
-    <w:bookmarkEnd w:id="62"/>
-    <w:bookmarkEnd w:id="63"/>
+    <w:bookmarkEnd w:id="64"/>
+    <w:bookmarkEnd w:id="65"/>
     <w:sectPr>
       <w:footnotePr>
         <w:numRestart w:val="eachSect"/>

</xml_diff>

<commit_message>
Deploying to gh-pages from @ Morrison-Lab/sds@c87769b89bcb15e9070996d629133803f07f701a 🚀
</commit_message>
<xml_diff>
--- a/classification-handout.docx
+++ b/classification-handout.docx
@@ -15,7 +15,7 @@
         <w:pStyle w:val="Date"/>
       </w:pPr>
       <w:r>
-        <w:t xml:space="preserve">Last modified: 2026-10-19 01:42:24 (PDT)</w:t>
+        <w:t xml:space="preserve">Last modified: 2026-10-19 02:56:37 (PDT)</w:t>
       </w:r>
     </w:p>
     <w:bookmarkStart w:id="18" w:name="introduction"/>
@@ -4098,7 +4098,7 @@
     </w:p>
     <w:bookmarkEnd w:id="44"/>
     <w:bookmarkEnd w:id="45"/>
-    <w:bookmarkStart w:id="65" w:name="X076ffac91629c23ab63ea48ae4a49dc44f38759"/>
+    <w:bookmarkStart w:id="66" w:name="X076ffac91629c23ab63ea48ae4a49dc44f38759"/>
     <w:p>
       <w:pPr>
         <w:pStyle w:val="Heading2"/>
@@ -4107,7 +4107,7 @@
         <w:t xml:space="preserve">4 PPV in terms of sensitivity, specificity, and prevalence</w:t>
       </w:r>
     </w:p>
-    <w:bookmarkStart w:id="46" w:name="exr-prob-positive"/>
+    <w:bookmarkStart w:id="47" w:name="exr-prob-positive"/>
     <w:p>
       <w:pPr>
         <w:pStyle w:val="FirstParagraph"/>
@@ -4123,8 +4123,19 @@
         <w:t xml:space="preserve"> </w:t>
       </w:r>
       <w:r>
-        <w:t xml:space="preserve">Write the probability</w:t>
-      </w:r>
+        <w:t xml:space="preserve">Derive an expression for the</w:t>
+      </w:r>
+      <w:r>
+        <w:t xml:space="preserve"> </w:t>
+      </w:r>
+      <w:hyperlink r:id="rId46">
+        <w:r>
+          <w:rPr>
+            <w:rStyle w:val="Hyperlink"/>
+          </w:rPr>
+          <w:t xml:space="preserve">probability</w:t>
+        </w:r>
+      </w:hyperlink>
       <w:r>
         <w:t xml:space="preserve"> </w:t>
       </w:r>
@@ -4248,8 +4259,8 @@
         <w:t xml:space="preserve">of the disease.</w:t>
       </w:r>
     </w:p>
-    <w:bookmarkEnd w:id="46"/>
-    <w:bookmarkStart w:id="48" w:name="sol-prob-positive"/>
+    <w:bookmarkEnd w:id="47"/>
+    <w:bookmarkStart w:id="49" w:name="sol-prob-positive"/>
     <w:p>
       <w:pPr>
         <w:pStyle w:val="FirstParagraph"/>
@@ -4331,7 +4342,7 @@
       <w:pPr>
         <w:pStyle w:val="BodyText"/>
       </w:pPr>
-      <w:bookmarkStart w:id="47" w:name="eq-prob-positive-exr"/>
+      <w:bookmarkStart w:id="48" w:name="eq-prob-positive-exr"/>
       <m:oMathPara>
         <m:oMathParaPr>
           <m:jc m:val="center"/>
@@ -5341,10 +5352,10 @@
           </m:r>
         </m:oMath>
       </m:oMathPara>
-      <w:bookmarkEnd w:id="47"/>
+      <w:bookmarkEnd w:id="48"/>
     </w:p>
-    <w:bookmarkEnd w:id="48"/>
-    <w:bookmarkStart w:id="50" w:name="thm-prob-positive"/>
+    <w:bookmarkEnd w:id="49"/>
+    <w:bookmarkStart w:id="51" w:name="thm-prob-positive"/>
     <w:p>
       <w:pPr>
         <w:pStyle w:val="FirstParagraph"/>
@@ -5512,7 +5523,7 @@
       <w:pPr>
         <w:pStyle w:val="BodyText"/>
       </w:pPr>
-      <w:bookmarkStart w:id="49" w:name="eq-prob-positive"/>
+      <w:bookmarkStart w:id="50" w:name="eq-prob-positive"/>
       <m:oMathPara>
         <m:oMathParaPr>
           <m:jc m:val="center"/>
@@ -5656,9 +5667,9 @@
           </m:r>
         </m:oMath>
       </m:oMathPara>
-      <w:bookmarkEnd w:id="49"/>
+      <w:bookmarkEnd w:id="50"/>
     </w:p>
-    <w:bookmarkEnd w:id="50"/>
+    <w:bookmarkEnd w:id="51"/>
     <w:p>
       <w:pPr>
         <w:pStyle w:val="FirstParagraph"/>
@@ -5705,7 +5716,7 @@
         <w:t xml:space="preserve">.</w:t>
       </w:r>
     </w:p>
-    <w:bookmarkStart w:id="51" w:name="exr-ppv-bayes"/>
+    <w:bookmarkStart w:id="52" w:name="exr-ppv-bayes"/>
     <w:p>
       <w:pPr>
         <w:pStyle w:val="BodyText"/>
@@ -5721,7 +5732,7 @@
         <w:t xml:space="preserve"> </w:t>
       </w:r>
       <w:r>
-        <w:t xml:space="preserve">Write the</w:t>
+        <w:t xml:space="preserve">Derive an expression for the</w:t>
       </w:r>
       <w:r>
         <w:t xml:space="preserve"> </w:t>
@@ -5828,8 +5839,8 @@
         <w:t xml:space="preserve">of the disease.</w:t>
       </w:r>
     </w:p>
-    <w:bookmarkEnd w:id="51"/>
-    <w:bookmarkStart w:id="53" w:name="sol-ppv-bayes"/>
+    <w:bookmarkEnd w:id="52"/>
+    <w:bookmarkStart w:id="54" w:name="sol-ppv-bayes"/>
     <w:p>
       <w:pPr>
         <w:pStyle w:val="FirstParagraph"/>
@@ -5945,7 +5956,7 @@
       <w:pPr>
         <w:pStyle w:val="BodyText"/>
       </w:pPr>
-      <w:bookmarkStart w:id="52" w:name="eq-ppv-bayes-exr"/>
+      <w:bookmarkStart w:id="53" w:name="eq-ppv-bayes-exr"/>
       <m:oMathPara>
         <m:oMathParaPr>
           <m:jc m:val="center"/>
@@ -6468,10 +6479,10 @@
           </m:r>
         </m:oMath>
       </m:oMathPara>
-      <w:bookmarkEnd w:id="52"/>
+      <w:bookmarkEnd w:id="53"/>
     </w:p>
-    <w:bookmarkEnd w:id="53"/>
-    <w:bookmarkStart w:id="55" w:name="thm-ppv-bayes"/>
+    <w:bookmarkEnd w:id="54"/>
+    <w:bookmarkStart w:id="56" w:name="thm-ppv-bayes"/>
     <w:p>
       <w:pPr>
         <w:pStyle w:val="FirstParagraph"/>
@@ -6732,7 +6743,7 @@
       <w:pPr>
         <w:pStyle w:val="BodyText"/>
       </w:pPr>
-      <w:bookmarkStart w:id="54" w:name="eq-ppv-bayes"/>
+      <w:bookmarkStart w:id="55" w:name="eq-ppv-bayes"/>
       <m:oMathPara>
         <m:oMathParaPr>
           <m:jc m:val="center"/>
@@ -6884,7 +6895,7 @@
           </m:r>
         </m:oMath>
       </m:oMathPara>
-      <w:bookmarkEnd w:id="54"/>
+      <w:bookmarkEnd w:id="55"/>
     </w:p>
     <w:p>
       <w:pPr>
@@ -6903,7 +6914,7 @@
         <w:t xml:space="preserve">.</w:t>
       </w:r>
     </w:p>
-    <w:bookmarkEnd w:id="55"/>
+    <w:bookmarkEnd w:id="56"/>
     <w:p>
       <w:pPr>
         <w:pStyle w:val="BodyText"/>
@@ -6970,7 +6981,7 @@
         <w:t xml:space="preserve">.</w:t>
       </w:r>
     </w:p>
-    <w:bookmarkStart w:id="56" w:name="exr-ppv-ratio-form"/>
+    <w:bookmarkStart w:id="57" w:name="exr-ppv-ratio-form"/>
     <w:p>
       <w:pPr>
         <w:pStyle w:val="BodyText"/>
@@ -7096,8 +7107,8 @@
         <w:t xml:space="preserve">of non-diseased to diseased people in the population.</w:t>
       </w:r>
     </w:p>
-    <w:bookmarkEnd w:id="56"/>
-    <w:bookmarkStart w:id="58" w:name="sol-ppv-ratio-form"/>
+    <w:bookmarkEnd w:id="57"/>
+    <w:bookmarkStart w:id="59" w:name="sol-ppv-ratio-form"/>
     <w:p>
       <w:pPr>
         <w:pStyle w:val="BodyText"/>
@@ -7368,7 +7379,7 @@
       <w:pPr>
         <w:pStyle w:val="BodyText"/>
       </w:pPr>
-      <w:bookmarkStart w:id="57" w:name="eq-ppv-ratio-form-exr"/>
+      <w:bookmarkStart w:id="58" w:name="eq-ppv-ratio-form-exr"/>
       <m:oMathPara>
         <m:oMathParaPr>
           <m:jc m:val="center"/>
@@ -7972,10 +7983,10 @@
           </m:r>
         </m:oMath>
       </m:oMathPara>
-      <w:bookmarkEnd w:id="57"/>
+      <w:bookmarkEnd w:id="58"/>
     </w:p>
-    <w:bookmarkEnd w:id="58"/>
-    <w:bookmarkStart w:id="60" w:name="thm-ppv-sens-spec-prev"/>
+    <w:bookmarkEnd w:id="59"/>
+    <w:bookmarkStart w:id="61" w:name="thm-ppv-sens-spec-prev"/>
     <w:p>
       <w:pPr>
         <w:pStyle w:val="FirstParagraph"/>
@@ -8048,7 +8059,7 @@
       <w:pPr>
         <w:pStyle w:val="BodyText"/>
       </w:pPr>
-      <w:bookmarkStart w:id="59" w:name="eq-ppv-sens-spec-prev"/>
+      <w:bookmarkStart w:id="60" w:name="eq-ppv-sens-spec-prev"/>
       <m:oMathPara>
         <m:oMathParaPr>
           <m:jc m:val="center"/>
@@ -8170,9 +8181,9 @@
           </m:r>
         </m:oMath>
       </m:oMathPara>
-      <w:bookmarkEnd w:id="59"/>
+      <w:bookmarkEnd w:id="60"/>
     </w:p>
-    <w:bookmarkEnd w:id="60"/>
+    <w:bookmarkEnd w:id="61"/>
     <w:p>
       <w:pPr>
         <w:pStyle w:val="FirstParagraph"/>
@@ -8256,7 +8267,7 @@
         <w:t xml:space="preserve">.</w:t>
       </w:r>
     </w:p>
-    <w:bookmarkStart w:id="63" w:name="exm-ppv-sens-spec-prev"/>
+    <w:bookmarkStart w:id="64" w:name="exm-ppv-sens-spec-prev"/>
     <w:p>
       <w:pPr>
         <w:pStyle w:val="BodyText"/>
@@ -8347,7 +8358,7 @@
       <w:pPr>
         <w:pStyle w:val="BodyText"/>
       </w:pPr>
-      <w:bookmarkStart w:id="61" w:name="eq-ppv-sens-spec-prev-exm"/>
+      <w:bookmarkStart w:id="62" w:name="eq-ppv-sens-spec-prev-exm"/>
       <m:oMathPara>
         <m:oMathParaPr>
           <m:jc m:val="center"/>
@@ -8840,7 +8851,7 @@
           </m:r>
         </m:oMath>
       </m:oMathPara>
-      <w:bookmarkEnd w:id="61"/>
+      <w:bookmarkEnd w:id="62"/>
     </w:p>
     <w:p>
       <w:pPr>
@@ -8923,7 +8934,7 @@
       <w:pPr>
         <w:pStyle w:val="BodyText"/>
       </w:pPr>
-      <w:bookmarkStart w:id="62" w:name="eq-ppv-sens-spec-prev-exm-2"/>
+      <w:bookmarkStart w:id="63" w:name="eq-ppv-sens-spec-prev-exm-2"/>
       <m:oMathPara>
         <m:oMathParaPr>
           <m:jc m:val="center"/>
@@ -9198,7 +9209,7 @@
           </m:r>
         </m:oMath>
       </m:oMathPara>
-      <w:bookmarkEnd w:id="62"/>
+      <w:bookmarkEnd w:id="63"/>
     </w:p>
     <w:p>
       <w:pPr>
@@ -9208,8 +9219,8 @@
         <w:t xml:space="preserve">so about 9 in 10 positive results would be false positives.</w:t>
       </w:r>
     </w:p>
-    <w:bookmarkEnd w:id="63"/>
-    <w:bookmarkStart w:id="64" w:name="rem-ppv-prevalence"/>
+    <w:bookmarkEnd w:id="64"/>
+    <w:bookmarkStart w:id="65" w:name="rem-ppv-prevalence"/>
     <w:p>
       <w:pPr>
         <w:pStyle w:val="BodyText"/>
@@ -9333,9 +9344,9 @@
         <w:t xml:space="preserve">shows.</w:t>
       </w:r>
     </w:p>
-    <w:bookmarkEnd w:id="64"/>
     <w:bookmarkEnd w:id="65"/>
-    <w:bookmarkStart w:id="69" w:name="agreement-between-two-classifiers"/>
+    <w:bookmarkEnd w:id="66"/>
+    <w:bookmarkStart w:id="70" w:name="agreement-between-two-classifiers"/>
     <w:p>
       <w:pPr>
         <w:pStyle w:val="Heading2"/>
@@ -9420,7 +9431,7 @@
         <w:t xml:space="preserve">.</w:t>
       </w:r>
     </w:p>
-    <w:bookmarkStart w:id="67" w:name="def-agreement-table"/>
+    <w:bookmarkStart w:id="68" w:name="def-agreement-table"/>
     <w:p>
       <w:pPr>
         <w:pStyle w:val="BodyText"/>
@@ -9863,7 +9874,7 @@
       <w:pPr>
         <w:pStyle w:val="BodyText"/>
       </w:pPr>
-      <w:bookmarkStart w:id="66" w:name="eq-agreement-table-n"/>
+      <w:bookmarkStart w:id="67" w:name="eq-agreement-table-n"/>
       <m:oMathPara>
         <m:oMathParaPr>
           <m:jc m:val="center"/>
@@ -9941,7 +9952,7 @@
           </m:r>
         </m:oMath>
       </m:oMathPara>
-      <w:bookmarkEnd w:id="66"/>
+      <w:bookmarkEnd w:id="67"/>
     </w:p>
     <w:p>
       <w:pPr>
@@ -9960,8 +9971,8 @@
         <w:t xml:space="preserve">.</w:t>
       </w:r>
     </w:p>
-    <w:bookmarkEnd w:id="67"/>
-    <w:bookmarkStart w:id="68" w:name="exm-agreement-table-covid"/>
+    <w:bookmarkEnd w:id="68"/>
+    <w:bookmarkStart w:id="69" w:name="exm-agreement-table-covid"/>
     <w:p>
       <w:pPr>
         <w:pStyle w:val="BodyText"/>
@@ -10882,9 +10893,9 @@
         <w:t xml:space="preserve">#&gt;  693   93    7 9207</w:t>
       </w:r>
     </w:p>
-    <w:bookmarkEnd w:id="68"/>
     <w:bookmarkEnd w:id="69"/>
-    <w:bookmarkStart w:id="89" w:name="agreement-proportions"/>
+    <w:bookmarkEnd w:id="70"/>
+    <w:bookmarkStart w:id="90" w:name="agreement-proportions"/>
     <w:p>
       <w:pPr>
         <w:pStyle w:val="Heading2"/>
@@ -10893,7 +10904,7 @@
         <w:t xml:space="preserve">6 Agreement proportions</w:t>
       </w:r>
     </w:p>
-    <w:bookmarkStart w:id="71" w:name="def-overall-agreement"/>
+    <w:bookmarkStart w:id="72" w:name="def-overall-agreement"/>
     <w:p>
       <w:pPr>
         <w:pStyle w:val="FirstParagraph"/>
@@ -10955,7 +10966,7 @@
       <w:pPr>
         <w:pStyle w:val="BodyText"/>
       </w:pPr>
-      <w:bookmarkStart w:id="70" w:name="eq-overall-agreement"/>
+      <w:bookmarkStart w:id="71" w:name="eq-overall-agreement"/>
       <m:oMathPara>
         <m:oMathParaPr>
           <m:jc m:val="center"/>
@@ -11036,10 +11047,10 @@
           </m:r>
         </m:oMath>
       </m:oMathPara>
-      <w:bookmarkEnd w:id="70"/>
+      <w:bookmarkEnd w:id="71"/>
     </w:p>
-    <w:bookmarkEnd w:id="71"/>
-    <w:bookmarkStart w:id="73" w:name="exm-overall-agreement"/>
+    <w:bookmarkEnd w:id="72"/>
+    <w:bookmarkStart w:id="74" w:name="exm-overall-agreement"/>
     <w:p>
       <w:pPr>
         <w:pStyle w:val="FirstParagraph"/>
@@ -11093,7 +11104,7 @@
       <w:pPr>
         <w:pStyle w:val="BodyText"/>
       </w:pPr>
-      <w:bookmarkStart w:id="72" w:name="eq-exm-overall-agreement"/>
+      <w:bookmarkStart w:id="73" w:name="eq-exm-overall-agreement"/>
       <m:oMathPara>
         <m:oMathParaPr>
           <m:jc m:val="center"/>
@@ -11302,10 +11313,10 @@
           </m:r>
         </m:oMath>
       </m:oMathPara>
-      <w:bookmarkEnd w:id="72"/>
+      <w:bookmarkEnd w:id="73"/>
     </w:p>
-    <w:bookmarkEnd w:id="73"/>
-    <w:bookmarkStart w:id="75" w:name="def-positive-agreement"/>
+    <w:bookmarkEnd w:id="74"/>
+    <w:bookmarkStart w:id="76" w:name="def-positive-agreement"/>
     <w:p>
       <w:pPr>
         <w:pStyle w:val="FirstParagraph"/>
@@ -11436,7 +11447,7 @@
       <w:pPr>
         <w:pStyle w:val="BodyText"/>
       </w:pPr>
-      <w:bookmarkStart w:id="74" w:name="eq-positive-agreement"/>
+      <w:bookmarkStart w:id="75" w:name="eq-positive-agreement"/>
       <m:oMathPara>
         <m:oMathParaPr>
           <m:jc m:val="center"/>
@@ -11536,7 +11547,7 @@
           </m:r>
         </m:oMath>
       </m:oMathPara>
-      <w:bookmarkEnd w:id="74"/>
+      <w:bookmarkEnd w:id="75"/>
     </w:p>
     <w:p>
       <w:pPr>
@@ -11555,8 +11566,8 @@
         <w:t xml:space="preserve">.</w:t>
       </w:r>
     </w:p>
-    <w:bookmarkEnd w:id="75"/>
-    <w:bookmarkStart w:id="77" w:name="exm-positive-agreement"/>
+    <w:bookmarkEnd w:id="76"/>
+    <w:bookmarkStart w:id="78" w:name="exm-positive-agreement"/>
     <w:p>
       <w:pPr>
         <w:pStyle w:val="BodyText"/>
@@ -11610,7 +11621,7 @@
       <w:pPr>
         <w:pStyle w:val="BodyText"/>
       </w:pPr>
-      <w:bookmarkStart w:id="76" w:name="eq-exm-positive-agreement"/>
+      <w:bookmarkStart w:id="77" w:name="eq-exm-positive-agreement"/>
       <m:oMathPara>
         <m:oMathParaPr>
           <m:jc m:val="center"/>
@@ -11911,7 +11922,7 @@
           </m:r>
         </m:oMath>
       </m:oMathPara>
-      <w:bookmarkEnd w:id="76"/>
+      <w:bookmarkEnd w:id="77"/>
     </w:p>
     <w:p>
       <w:pPr>
@@ -11944,8 +11955,8 @@
         <w:t xml:space="preserve">relative to the 693 true positives.</w:t>
       </w:r>
     </w:p>
-    <w:bookmarkEnd w:id="77"/>
-    <w:bookmarkStart w:id="79" w:name="def-negative-agreement"/>
+    <w:bookmarkEnd w:id="78"/>
+    <w:bookmarkStart w:id="80" w:name="def-negative-agreement"/>
     <w:p>
       <w:pPr>
         <w:pStyle w:val="BodyText"/>
@@ -12076,7 +12087,7 @@
       <w:pPr>
         <w:pStyle w:val="BodyText"/>
       </w:pPr>
-      <w:bookmarkStart w:id="78" w:name="eq-negative-agreement"/>
+      <w:bookmarkStart w:id="79" w:name="eq-negative-agreement"/>
       <m:oMathPara>
         <m:oMathParaPr>
           <m:jc m:val="center"/>
@@ -12176,7 +12187,7 @@
           </m:r>
         </m:oMath>
       </m:oMathPara>
-      <w:bookmarkEnd w:id="78"/>
+      <w:bookmarkEnd w:id="79"/>
     </w:p>
     <w:p>
       <w:pPr>
@@ -12195,8 +12206,8 @@
         <w:t xml:space="preserve">.</w:t>
       </w:r>
     </w:p>
-    <w:bookmarkEnd w:id="79"/>
-    <w:bookmarkStart w:id="81" w:name="exm-negative-agreement"/>
+    <w:bookmarkEnd w:id="80"/>
+    <w:bookmarkStart w:id="82" w:name="exm-negative-agreement"/>
     <w:p>
       <w:pPr>
         <w:pStyle w:val="BodyText"/>
@@ -12250,7 +12261,7 @@
       <w:pPr>
         <w:pStyle w:val="BodyText"/>
       </w:pPr>
-      <w:bookmarkStart w:id="80" w:name="eq-exm-negative-agreement"/>
+      <w:bookmarkStart w:id="81" w:name="eq-exm-negative-agreement"/>
       <m:oMathPara>
         <m:oMathParaPr>
           <m:jc m:val="center"/>
@@ -12569,7 +12580,7 @@
           </m:r>
         </m:oMath>
       </m:oMathPara>
-      <w:bookmarkEnd w:id="80"/>
+      <w:bookmarkEnd w:id="81"/>
     </w:p>
     <w:p>
       <w:pPr>
@@ -12602,8 +12613,8 @@
         <w:t xml:space="preserve">relative to the 9,207 shared negative calls.</w:t>
       </w:r>
     </w:p>
-    <w:bookmarkEnd w:id="81"/>
-    <w:bookmarkStart w:id="83" w:name="def-agent-only-rate"/>
+    <w:bookmarkEnd w:id="82"/>
+    <w:bookmarkStart w:id="84" w:name="def-agent-only-rate"/>
     <w:p>
       <w:pPr>
         <w:pStyle w:val="BodyText"/>
@@ -12665,7 +12676,7 @@
       <w:pPr>
         <w:pStyle w:val="BodyText"/>
       </w:pPr>
-      <w:bookmarkStart w:id="82" w:name="eq-agent-only-rate"/>
+      <w:bookmarkStart w:id="83" w:name="eq-agent-only-rate"/>
       <m:oMathPara>
         <m:oMathParaPr>
           <m:jc m:val="center"/>
@@ -12741,10 +12752,10 @@
           </m:r>
         </m:oMath>
       </m:oMathPara>
-      <w:bookmarkEnd w:id="82"/>
+      <w:bookmarkEnd w:id="83"/>
     </w:p>
-    <w:bookmarkEnd w:id="83"/>
-    <w:bookmarkStart w:id="85" w:name="exm-agent-only-rate"/>
+    <w:bookmarkEnd w:id="84"/>
+    <w:bookmarkStart w:id="86" w:name="exm-agent-only-rate"/>
     <w:p>
       <w:pPr>
         <w:pStyle w:val="FirstParagraph"/>
@@ -12798,7 +12809,7 @@
       <w:pPr>
         <w:pStyle w:val="BodyText"/>
       </w:pPr>
-      <w:bookmarkStart w:id="84" w:name="eq-exm-agent-only-rate"/>
+      <w:bookmarkStart w:id="85" w:name="eq-exm-agent-only-rate"/>
       <m:oMathPara>
         <m:oMathParaPr>
           <m:jc m:val="center"/>
@@ -12940,7 +12951,7 @@
           </m:r>
         </m:oMath>
       </m:oMathPara>
-      <w:bookmarkEnd w:id="84"/>
+      <w:bookmarkEnd w:id="85"/>
     </w:p>
     <w:p>
       <w:pPr>
@@ -12956,8 +12967,8 @@
         <w:t xml:space="preserve">are called positive by the test and negative by the reference.</w:t>
       </w:r>
     </w:p>
-    <w:bookmarkEnd w:id="85"/>
-    <w:bookmarkStart w:id="87" w:name="def-agreement-test-measures"/>
+    <w:bookmarkEnd w:id="86"/>
+    <w:bookmarkStart w:id="88" w:name="def-agreement-test-measures"/>
     <w:p>
       <w:pPr>
         <w:pStyle w:val="BodyText"/>
@@ -13121,7 +13132,7 @@
       <w:pPr>
         <w:pStyle w:val="BodyText"/>
       </w:pPr>
-      <w:bookmarkStart w:id="86" w:name="eq-agreement-test-measures"/>
+      <w:bookmarkStart w:id="87" w:name="eq-agreement-test-measures"/>
       <m:oMathPara>
         <m:oMathParaPr>
           <m:jc m:val="center"/>
@@ -13421,10 +13432,10 @@
           </m:r>
         </m:oMath>
       </m:oMathPara>
-      <w:bookmarkEnd w:id="86"/>
+      <w:bookmarkEnd w:id="87"/>
     </w:p>
-    <w:bookmarkEnd w:id="87"/>
-    <w:bookmarkStart w:id="88" w:name="exm-agreement-test-measures"/>
+    <w:bookmarkEnd w:id="88"/>
+    <w:bookmarkStart w:id="89" w:name="exm-agreement-test-measures"/>
     <w:p>
       <w:pPr>
         <w:pStyle w:val="FirstParagraph"/>
@@ -13845,9 +13856,9 @@
         <w:t xml:space="preserve">because the table’s counts are the expected counts for those values.</w:t>
       </w:r>
     </w:p>
-    <w:bookmarkEnd w:id="88"/>
     <w:bookmarkEnd w:id="89"/>
-    <w:bookmarkStart w:id="108" w:name="Xfdf20c93d4007a65a2a3ab2eb6d3410cd188162"/>
+    <w:bookmarkEnd w:id="90"/>
+    <w:bookmarkStart w:id="109" w:name="Xfdf20c93d4007a65a2a3ab2eb6d3410cd188162"/>
     <w:p>
       <w:pPr>
         <w:pStyle w:val="Heading2"/>
@@ -13856,7 +13867,7 @@
         <w:t xml:space="preserve">7 Positive and negative agreement as harmonic means</w:t>
       </w:r>
     </w:p>
-    <w:bookmarkStart w:id="91" w:name="def-harmonic-mean"/>
+    <w:bookmarkStart w:id="92" w:name="def-harmonic-mean"/>
     <w:p>
       <w:pPr>
         <w:pStyle w:val="FirstParagraph"/>
@@ -13923,7 +13934,7 @@
       <w:pPr>
         <w:pStyle w:val="BodyText"/>
       </w:pPr>
-      <w:bookmarkStart w:id="90" w:name="eq-harmonic-mean"/>
+      <w:bookmarkStart w:id="91" w:name="eq-harmonic-mean"/>
       <m:oMathPara>
         <m:oMathParaPr>
           <m:jc m:val="center"/>
@@ -14043,7 +14054,7 @@
           </m:r>
         </m:oMath>
       </m:oMathPara>
-      <w:bookmarkEnd w:id="90"/>
+      <w:bookmarkEnd w:id="91"/>
     </w:p>
     <w:p>
       <w:pPr>
@@ -14062,8 +14073,8 @@
         <w:t xml:space="preserve">.</w:t>
       </w:r>
     </w:p>
-    <w:bookmarkEnd w:id="91"/>
-    <w:bookmarkStart w:id="93" w:name="exm-harmonic-mean"/>
+    <w:bookmarkEnd w:id="92"/>
+    <w:bookmarkStart w:id="94" w:name="exm-harmonic-mean"/>
     <w:p>
       <w:pPr>
         <w:pStyle w:val="BodyText"/>
@@ -14100,7 +14111,7 @@
       <w:pPr>
         <w:pStyle w:val="BodyText"/>
       </w:pPr>
-      <w:bookmarkStart w:id="92" w:name="eq-exm-harmonic-mean"/>
+      <w:bookmarkStart w:id="93" w:name="eq-exm-harmonic-mean"/>
       <m:oMathPara>
         <m:oMathParaPr>
           <m:jc m:val="center"/>
@@ -14351,7 +14362,7 @@
           </m:r>
         </m:oMath>
       </m:oMathPara>
-      <w:bookmarkEnd w:id="92"/>
+      <w:bookmarkEnd w:id="93"/>
     </w:p>
     <w:p>
       <w:pPr>
@@ -14367,8 +14378,8 @@
         <w:t xml:space="preserve">the harmonic mean sits closer to the smaller number.</w:t>
       </w:r>
     </w:p>
-    <w:bookmarkEnd w:id="93"/>
-    <w:bookmarkStart w:id="94" w:name="exr-pos-agreement-harmonic"/>
+    <w:bookmarkEnd w:id="94"/>
+    <w:bookmarkStart w:id="95" w:name="exr-pos-agreement-harmonic"/>
     <w:p>
       <w:pPr>
         <w:pStyle w:val="BodyText"/>
@@ -14464,8 +14475,8 @@
         <w:t xml:space="preserve">in terms of the table’s cells.</w:t>
       </w:r>
     </w:p>
-    <w:bookmarkEnd w:id="94"/>
-    <w:bookmarkStart w:id="96" w:name="sol-pos-agreement-harmonic"/>
+    <w:bookmarkEnd w:id="95"/>
+    <w:bookmarkStart w:id="97" w:name="sol-pos-agreement-harmonic"/>
     <w:p>
       <w:pPr>
         <w:pStyle w:val="BodyText"/>
@@ -14566,7 +14577,7 @@
       <w:pPr>
         <w:pStyle w:val="BodyText"/>
       </w:pPr>
-      <w:bookmarkStart w:id="95" w:name="eq-exr-pos-agreement-harmonic"/>
+      <w:bookmarkStart w:id="96" w:name="eq-exr-pos-agreement-harmonic"/>
       <m:oMathPara>
         <m:oMathParaPr>
           <m:jc m:val="center"/>
@@ -15732,10 +15743,10 @@
           </m:r>
         </m:oMath>
       </m:oMathPara>
-      <w:bookmarkEnd w:id="95"/>
+      <w:bookmarkEnd w:id="96"/>
     </w:p>
-    <w:bookmarkEnd w:id="96"/>
-    <w:bookmarkStart w:id="98" w:name="thm-pos-agreement-harmonic"/>
+    <w:bookmarkEnd w:id="97"/>
+    <w:bookmarkStart w:id="99" w:name="thm-pos-agreement-harmonic"/>
     <w:p>
       <w:pPr>
         <w:pStyle w:val="FirstParagraph"/>
@@ -15835,7 +15846,7 @@
       <w:pPr>
         <w:pStyle w:val="BodyText"/>
       </w:pPr>
-      <w:bookmarkStart w:id="97" w:name="eq-pos-agreement-harmonic"/>
+      <w:bookmarkStart w:id="98" w:name="eq-pos-agreement-harmonic"/>
       <m:oMathPara>
         <m:oMathParaPr>
           <m:jc m:val="center"/>
@@ -15936,9 +15947,9 @@
           </m:r>
         </m:oMath>
       </m:oMathPara>
-      <w:bookmarkEnd w:id="97"/>
+      <w:bookmarkEnd w:id="98"/>
     </w:p>
-    <w:bookmarkEnd w:id="98"/>
+    <w:bookmarkEnd w:id="99"/>
     <w:p>
       <w:pPr>
         <w:pStyle w:val="FirstParagraph"/>
@@ -16080,7 +16091,7 @@
         <w:t xml:space="preserve">.</w:t>
       </w:r>
     </w:p>
-    <w:bookmarkStart w:id="100" w:name="exm-pos-agreement-harmonic"/>
+    <w:bookmarkStart w:id="101" w:name="exm-pos-agreement-harmonic"/>
     <w:p>
       <w:pPr>
         <w:pStyle w:val="BodyText"/>
@@ -16197,7 +16208,7 @@
       <w:pPr>
         <w:pStyle w:val="BodyText"/>
       </w:pPr>
-      <w:bookmarkStart w:id="99" w:name="eq-exm-pos-agreement-harmonic"/>
+      <w:bookmarkStart w:id="100" w:name="eq-exm-pos-agreement-harmonic"/>
       <m:oMathPara>
         <m:oMathParaPr>
           <m:jc m:val="center"/>
@@ -16685,7 +16696,7 @@
           </m:r>
         </m:oMath>
       </m:oMathPara>
-      <w:bookmarkEnd w:id="99"/>
+      <w:bookmarkEnd w:id="100"/>
     </w:p>
     <w:p>
       <w:pPr>
@@ -16741,8 +16752,8 @@
         <w:t xml:space="preserve">.</w:t>
       </w:r>
     </w:p>
-    <w:bookmarkEnd w:id="100"/>
-    <w:bookmarkStart w:id="101" w:name="exr-neg-agreement-harmonic"/>
+    <w:bookmarkEnd w:id="101"/>
+    <w:bookmarkStart w:id="102" w:name="exr-neg-agreement-harmonic"/>
     <w:p>
       <w:pPr>
         <w:pStyle w:val="BodyText"/>
@@ -16838,8 +16849,8 @@
         <w:t xml:space="preserve">in terms of the table’s cells.</w:t>
       </w:r>
     </w:p>
-    <w:bookmarkEnd w:id="101"/>
-    <w:bookmarkStart w:id="103" w:name="sol-neg-agreement-harmonic"/>
+    <w:bookmarkEnd w:id="102"/>
+    <w:bookmarkStart w:id="104" w:name="sol-neg-agreement-harmonic"/>
     <w:p>
       <w:pPr>
         <w:pStyle w:val="BodyText"/>
@@ -16940,7 +16951,7 @@
       <w:pPr>
         <w:pStyle w:val="BodyText"/>
       </w:pPr>
-      <w:bookmarkStart w:id="102" w:name="eq-exr-neg-agreement-harmonic"/>
+      <w:bookmarkStart w:id="103" w:name="eq-exr-neg-agreement-harmonic"/>
       <m:oMathPara>
         <m:oMathParaPr>
           <m:jc m:val="center"/>
@@ -18106,10 +18117,10 @@
           </m:r>
         </m:oMath>
       </m:oMathPara>
-      <w:bookmarkEnd w:id="102"/>
+      <w:bookmarkEnd w:id="103"/>
     </w:p>
-    <w:bookmarkEnd w:id="103"/>
-    <w:bookmarkStart w:id="105" w:name="thm-neg-agreement-harmonic"/>
+    <w:bookmarkEnd w:id="104"/>
+    <w:bookmarkStart w:id="106" w:name="thm-neg-agreement-harmonic"/>
     <w:p>
       <w:pPr>
         <w:pStyle w:val="FirstParagraph"/>
@@ -18209,7 +18220,7 @@
       <w:pPr>
         <w:pStyle w:val="BodyText"/>
       </w:pPr>
-      <w:bookmarkStart w:id="104" w:name="eq-neg-agreement-harmonic"/>
+      <w:bookmarkStart w:id="105" w:name="eq-neg-agreement-harmonic"/>
       <m:oMathPara>
         <m:oMathParaPr>
           <m:jc m:val="center"/>
@@ -18310,9 +18321,9 @@
           </m:r>
         </m:oMath>
       </m:oMathPara>
-      <w:bookmarkEnd w:id="104"/>
+      <w:bookmarkEnd w:id="105"/>
     </w:p>
-    <w:bookmarkEnd w:id="105"/>
+    <w:bookmarkEnd w:id="106"/>
     <w:p>
       <w:pPr>
         <w:pStyle w:val="FirstParagraph"/>
@@ -18454,7 +18465,7 @@
         <w:t xml:space="preserve">.</w:t>
       </w:r>
     </w:p>
-    <w:bookmarkStart w:id="107" w:name="exm-neg-agreement-harmonic"/>
+    <w:bookmarkStart w:id="108" w:name="exm-neg-agreement-harmonic"/>
     <w:p>
       <w:pPr>
         <w:pStyle w:val="BodyText"/>
@@ -18607,7 +18618,7 @@
       <w:pPr>
         <w:pStyle w:val="BodyText"/>
       </w:pPr>
-      <w:bookmarkStart w:id="106" w:name="eq-exm-neg-agreement-harmonic"/>
+      <w:bookmarkStart w:id="107" w:name="eq-exm-neg-agreement-harmonic"/>
       <m:oMathPara>
         <m:oMathParaPr>
           <m:jc m:val="center"/>
@@ -19221,7 +19232,7 @@
           </m:r>
         </m:oMath>
       </m:oMathPara>
-      <w:bookmarkEnd w:id="106"/>
+      <w:bookmarkEnd w:id="107"/>
     </w:p>
     <w:p>
       <w:pPr>
@@ -19245,9 +19256,9 @@
         <w:t xml:space="preserve">.</w:t>
       </w:r>
     </w:p>
-    <w:bookmarkEnd w:id="107"/>
     <w:bookmarkEnd w:id="108"/>
-    <w:bookmarkStart w:id="122" w:name="cohens-kappa"/>
+    <w:bookmarkEnd w:id="109"/>
+    <w:bookmarkStart w:id="123" w:name="cohens-kappa"/>
     <w:p>
       <w:pPr>
         <w:pStyle w:val="Heading2"/>
@@ -19256,7 +19267,7 @@
         <w:t xml:space="preserve">8 Cohen’s kappa</w:t>
       </w:r>
     </w:p>
-    <w:bookmarkStart w:id="110" w:name="def-chance-agreement"/>
+    <w:bookmarkStart w:id="111" w:name="def-chance-agreement"/>
     <w:p>
       <w:pPr>
         <w:pStyle w:val="FirstParagraph"/>
@@ -19324,7 +19335,7 @@
       <w:pPr>
         <w:pStyle w:val="BodyText"/>
       </w:pPr>
-      <w:bookmarkStart w:id="109" w:name="eq-chance-agreement"/>
+      <w:bookmarkStart w:id="110" w:name="eq-chance-agreement"/>
       <m:oMathPara>
         <m:oMathParaPr>
           <m:jc m:val="center"/>
@@ -19504,7 +19515,7 @@
           </m:r>
         </m:oMath>
       </m:oMathPara>
-      <w:bookmarkEnd w:id="109"/>
+      <w:bookmarkEnd w:id="110"/>
     </w:p>
     <w:p>
       <w:pPr>
@@ -19523,8 +19534,8 @@
         <w:t xml:space="preserve">.</w:t>
       </w:r>
     </w:p>
-    <w:bookmarkEnd w:id="110"/>
-    <w:bookmarkStart w:id="112" w:name="exm-chance-agreement"/>
+    <w:bookmarkEnd w:id="111"/>
+    <w:bookmarkStart w:id="113" w:name="exm-chance-agreement"/>
     <w:p>
       <w:pPr>
         <w:pStyle w:val="BodyText"/>
@@ -19578,7 +19589,7 @@
       <w:pPr>
         <w:pStyle w:val="BodyText"/>
       </w:pPr>
-      <w:bookmarkStart w:id="111" w:name="eq-exm-chance-agreement"/>
+      <w:bookmarkStart w:id="112" w:name="eq-exm-chance-agreement"/>
       <m:oMathPara>
         <m:oMathParaPr>
           <m:jc m:val="center"/>
@@ -20009,7 +20020,7 @@
           </m:r>
         </m:oMath>
       </m:oMathPara>
-      <w:bookmarkEnd w:id="111"/>
+      <w:bookmarkEnd w:id="112"/>
     </w:p>
     <w:p>
       <w:pPr>
@@ -20031,8 +20042,8 @@
         <w:t xml:space="preserve">would agree on about 86% of people by chance alone.</w:t>
       </w:r>
     </w:p>
-    <w:bookmarkEnd w:id="112"/>
-    <w:bookmarkStart w:id="117" w:name="def-cohen-kappa"/>
+    <w:bookmarkEnd w:id="113"/>
+    <w:bookmarkStart w:id="118" w:name="def-cohen-kappa"/>
     <w:p>
       <w:pPr>
         <w:pStyle w:val="BodyText"/>
@@ -20149,7 +20160,7 @@
       <w:pPr>
         <w:pStyle w:val="BodyText"/>
       </w:pPr>
-      <w:bookmarkStart w:id="113" w:name="eq-cohen-kappa"/>
+      <w:bookmarkStart w:id="114" w:name="eq-cohen-kappa"/>
       <m:oMathPara>
         <m:oMathParaPr>
           <m:jc m:val="center"/>
@@ -20257,7 +20268,7 @@
           </m:r>
         </m:oMath>
       </m:oMathPara>
-      <w:bookmarkEnd w:id="113"/>
+      <w:bookmarkEnd w:id="114"/>
     </w:p>
     <w:tbl>
       <w:tblPr>
@@ -20300,18 +20311,18 @@
                 <wp:inline>
                   <wp:extent cx="152400" cy="152400"/>
                   <wp:effectExtent b="0" l="0" r="0" t="0"/>
-                  <wp:docPr descr="" title="" id="115" name="Picture"/>
+                  <wp:docPr descr="" title="" id="116" name="Picture"/>
                   <a:graphic>
                     <a:graphicData uri="http://schemas.openxmlformats.org/drawingml/2006/picture">
                       <pic:pic>
                         <pic:nvPicPr>
-                          <pic:cNvPr descr="/opt/quarto/share/formats/docx/note.png" id="116" name="Picture"/>
+                          <pic:cNvPr descr="/opt/quarto/share/formats/docx/note.png" id="117" name="Picture"/>
                           <pic:cNvPicPr>
                             <a:picLocks noChangeArrowheads="1" noChangeAspect="1"/>
                           </pic:cNvPicPr>
                         </pic:nvPicPr>
                         <pic:blipFill>
-                          <a:blip r:embed="rId114"/>
+                          <a:blip r:embed="rId115"/>
                           <a:stretch>
                             <a:fillRect/>
                           </a:stretch>
@@ -20387,8 +20398,8 @@
         </w:tc>
       </w:tr>
     </w:tbl>
-    <w:bookmarkEnd w:id="117"/>
-    <w:bookmarkStart w:id="119" w:name="exm-cohen-kappa-covid"/>
+    <w:bookmarkEnd w:id="118"/>
+    <w:bookmarkStart w:id="120" w:name="exm-cohen-kappa-covid"/>
     <w:p>
       <w:pPr>
         <w:pStyle w:val="BodyText"/>
@@ -20534,7 +20545,7 @@
       <w:pPr>
         <w:pStyle w:val="BodyText"/>
       </w:pPr>
-      <w:bookmarkStart w:id="118" w:name="eq-exm-cohen-kappa"/>
+      <w:bookmarkStart w:id="119" w:name="eq-exm-cohen-kappa"/>
       <m:oMathPara>
         <m:oMathParaPr>
           <m:jc m:val="center"/>
@@ -20746,7 +20757,7 @@
           </m:r>
         </m:oMath>
       </m:oMathPara>
-      <w:bookmarkEnd w:id="118"/>
+      <w:bookmarkEnd w:id="119"/>
     </w:p>
     <w:p>
       <w:pPr>
@@ -21116,8 +21127,8 @@
         <w:t xml:space="preserve">#&gt; [1] 0.927323</w:t>
       </w:r>
     </w:p>
-    <w:bookmarkEnd w:id="119"/>
-    <w:bookmarkStart w:id="120" w:name="exm-kappa-paradox"/>
+    <w:bookmarkEnd w:id="120"/>
+    <w:bookmarkStart w:id="121" w:name="exm-kappa-paradox"/>
     <w:p>
       <w:pPr>
         <w:pStyle w:val="FirstParagraph"/>
@@ -22193,8 +22204,8 @@
         <w:t xml:space="preserve">(the first paradox).</w:t>
       </w:r>
     </w:p>
-    <w:bookmarkEnd w:id="120"/>
-    <w:bookmarkStart w:id="121" w:name="rem-kappa-prevalence"/>
+    <w:bookmarkEnd w:id="121"/>
+    <w:bookmarkStart w:id="122" w:name="rem-kappa-prevalence"/>
     <w:p>
       <w:pPr>
         <w:pStyle w:val="BodyText"/>
@@ -22327,9 +22338,9 @@
         <w:t xml:space="preserve">.</w:t>
       </w:r>
     </w:p>
-    <w:bookmarkEnd w:id="121"/>
     <w:bookmarkEnd w:id="122"/>
-    <w:bookmarkStart w:id="146" w:name="references"/>
+    <w:bookmarkEnd w:id="123"/>
+    <w:bookmarkStart w:id="147" w:name="references"/>
     <w:p>
       <w:pPr>
         <w:pStyle w:val="Heading2"/>
@@ -22338,8 +22349,8 @@
         <w:t xml:space="preserve">References</w:t>
       </w:r>
     </w:p>
-    <w:bookmarkStart w:id="145" w:name="refs"/>
-    <w:bookmarkStart w:id="124" w:name="ref-wikipedia_bayes_theorem"/>
+    <w:bookmarkStart w:id="146" w:name="refs"/>
+    <w:bookmarkStart w:id="125" w:name="ref-wikipedia_bayes_theorem"/>
     <w:p>
       <w:pPr>
         <w:pStyle w:val="Bibliography"/>
@@ -22386,7 +22397,7 @@
       <w:r>
         <w:t xml:space="preserve"> </w:t>
       </w:r>
-      <w:hyperlink r:id="rId123">
+      <w:hyperlink r:id="rId124">
         <w:r>
           <w:rPr>
             <w:rStyle w:val="Hyperlink"/>
@@ -22395,8 +22406,8 @@
         </w:r>
       </w:hyperlink>
     </w:p>
-    <w:bookmarkEnd w:id="124"/>
-    <w:bookmarkStart w:id="126" w:name="ref-wikipedia_statistical_classification"/>
+    <w:bookmarkEnd w:id="125"/>
+    <w:bookmarkStart w:id="127" w:name="ref-wikipedia_statistical_classification"/>
     <w:p>
       <w:pPr>
         <w:pStyle w:val="Bibliography"/>
@@ -22443,7 +22454,7 @@
       <w:r>
         <w:t xml:space="preserve"> </w:t>
       </w:r>
-      <w:hyperlink r:id="rId125">
+      <w:hyperlink r:id="rId126">
         <w:r>
           <w:rPr>
             <w:rStyle w:val="Hyperlink"/>
@@ -22452,8 +22463,8 @@
         </w:r>
       </w:hyperlink>
     </w:p>
-    <w:bookmarkEnd w:id="126"/>
-    <w:bookmarkStart w:id="128" w:name="Xbceaa659ebcdaa6beedc7b326ccf5dd7dd38991"/>
+    <w:bookmarkEnd w:id="127"/>
+    <w:bookmarkStart w:id="129" w:name="Xbceaa659ebcdaa6beedc7b326ccf5dd7dd38991"/>
     <w:p>
       <w:pPr>
         <w:pStyle w:val="Bibliography"/>
@@ -22500,7 +22511,7 @@
       <w:r>
         <w:t xml:space="preserve"> </w:t>
       </w:r>
-      <w:hyperlink r:id="rId127">
+      <w:hyperlink r:id="rId128">
         <w:r>
           <w:rPr>
             <w:rStyle w:val="Hyperlink"/>
@@ -22509,8 +22520,8 @@
         </w:r>
       </w:hyperlink>
     </w:p>
-    <w:bookmarkEnd w:id="128"/>
-    <w:bookmarkStart w:id="130" w:name="ref-wikipedia_prevalence"/>
+    <w:bookmarkEnd w:id="129"/>
+    <w:bookmarkStart w:id="131" w:name="ref-wikipedia_prevalence"/>
     <w:p>
       <w:pPr>
         <w:pStyle w:val="Bibliography"/>
@@ -22557,7 +22568,7 @@
       <w:r>
         <w:t xml:space="preserve"> </w:t>
       </w:r>
-      <w:hyperlink r:id="rId129">
+      <w:hyperlink r:id="rId130">
         <w:r>
           <w:rPr>
             <w:rStyle w:val="Hyperlink"/>
@@ -22566,8 +22577,8 @@
         </w:r>
       </w:hyperlink>
     </w:p>
-    <w:bookmarkEnd w:id="130"/>
-    <w:bookmarkStart w:id="132" w:name="X75cf9b9a05792cf5ef16b86615766f184108c69"/>
+    <w:bookmarkEnd w:id="131"/>
+    <w:bookmarkStart w:id="133" w:name="X75cf9b9a05792cf5ef16b86615766f184108c69"/>
     <w:p>
       <w:pPr>
         <w:pStyle w:val="Bibliography"/>
@@ -22614,7 +22625,7 @@
       <w:r>
         <w:t xml:space="preserve"> </w:t>
       </w:r>
-      <w:hyperlink r:id="rId131">
+      <w:hyperlink r:id="rId132">
         <w:r>
           <w:rPr>
             <w:rStyle w:val="Hyperlink"/>
@@ -22623,8 +22634,8 @@
         </w:r>
       </w:hyperlink>
     </w:p>
-    <w:bookmarkEnd w:id="132"/>
-    <w:bookmarkStart w:id="134" w:name="ref-wikipedia_confusion_matrix"/>
+    <w:bookmarkEnd w:id="133"/>
+    <w:bookmarkStart w:id="135" w:name="ref-wikipedia_confusion_matrix"/>
     <w:p>
       <w:pPr>
         <w:pStyle w:val="Bibliography"/>
@@ -22671,7 +22682,7 @@
       <w:r>
         <w:t xml:space="preserve"> </w:t>
       </w:r>
-      <w:hyperlink r:id="rId133">
+      <w:hyperlink r:id="rId134">
         <w:r>
           <w:rPr>
             <w:rStyle w:val="Hyperlink"/>
@@ -22680,8 +22691,8 @@
         </w:r>
       </w:hyperlink>
     </w:p>
-    <w:bookmarkEnd w:id="134"/>
-    <w:bookmarkStart w:id="136" w:name="ref-cicchetti1990high"/>
+    <w:bookmarkEnd w:id="135"/>
+    <w:bookmarkStart w:id="137" w:name="ref-cicchetti1990high"/>
     <w:p>
       <w:pPr>
         <w:pStyle w:val="Bibliography"/>
@@ -22741,7 +22752,7 @@
       <w:r>
         <w:t xml:space="preserve"> </w:t>
       </w:r>
-      <w:hyperlink r:id="rId135">
+      <w:hyperlink r:id="rId136">
         <w:r>
           <w:rPr>
             <w:rStyle w:val="Hyperlink"/>
@@ -22753,8 +22764,8 @@
         <w:t xml:space="preserve">.</w:t>
       </w:r>
     </w:p>
-    <w:bookmarkEnd w:id="136"/>
-    <w:bookmarkStart w:id="138" w:name="ref-wikipedia_harmonic_mean"/>
+    <w:bookmarkEnd w:id="137"/>
+    <w:bookmarkStart w:id="139" w:name="ref-wikipedia_harmonic_mean"/>
     <w:p>
       <w:pPr>
         <w:pStyle w:val="Bibliography"/>
@@ -22801,7 +22812,7 @@
       <w:r>
         <w:t xml:space="preserve"> </w:t>
       </w:r>
-      <w:hyperlink r:id="rId137">
+      <w:hyperlink r:id="rId138">
         <w:r>
           <w:rPr>
             <w:rStyle w:val="Hyperlink"/>
@@ -22810,8 +22821,8 @@
         </w:r>
       </w:hyperlink>
     </w:p>
-    <w:bookmarkEnd w:id="138"/>
-    <w:bookmarkStart w:id="140" w:name="ref-cohen1960coefficient"/>
+    <w:bookmarkEnd w:id="139"/>
+    <w:bookmarkStart w:id="141" w:name="ref-cohen1960coefficient"/>
     <w:p>
       <w:pPr>
         <w:pStyle w:val="Bibliography"/>
@@ -22850,7 +22861,7 @@
       <w:r>
         <w:t xml:space="preserve"> </w:t>
       </w:r>
-      <w:hyperlink r:id="rId139">
+      <w:hyperlink r:id="rId140">
         <w:r>
           <w:rPr>
             <w:rStyle w:val="Hyperlink"/>
@@ -22862,8 +22873,8 @@
         <w:t xml:space="preserve">.</w:t>
       </w:r>
     </w:p>
-    <w:bookmarkEnd w:id="140"/>
-    <w:bookmarkStart w:id="142" w:name="ref-wikipedia_cohens_kappa"/>
+    <w:bookmarkEnd w:id="141"/>
+    <w:bookmarkStart w:id="143" w:name="ref-wikipedia_cohens_kappa"/>
     <w:p>
       <w:pPr>
         <w:pStyle w:val="Bibliography"/>
@@ -22910,7 +22921,7 @@
       <w:r>
         <w:t xml:space="preserve"> </w:t>
       </w:r>
-      <w:hyperlink r:id="rId141">
+      <w:hyperlink r:id="rId142">
         <w:r>
           <w:rPr>
             <w:rStyle w:val="Hyperlink"/>
@@ -22919,8 +22930,8 @@
         </w:r>
       </w:hyperlink>
     </w:p>
-    <w:bookmarkEnd w:id="142"/>
-    <w:bookmarkStart w:id="144" w:name="ref-feinstein1990high"/>
+    <w:bookmarkEnd w:id="143"/>
+    <w:bookmarkStart w:id="145" w:name="ref-feinstein1990high"/>
     <w:p>
       <w:pPr>
         <w:pStyle w:val="Bibliography"/>
@@ -22980,7 +22991,7 @@
       <w:r>
         <w:t xml:space="preserve"> </w:t>
       </w:r>
-      <w:hyperlink r:id="rId143">
+      <w:hyperlink r:id="rId144">
         <w:r>
           <w:rPr>
             <w:rStyle w:val="Hyperlink"/>
@@ -22992,9 +23003,9 @@
         <w:t xml:space="preserve">.</w:t>
       </w:r>
     </w:p>
-    <w:bookmarkEnd w:id="144"/>
     <w:bookmarkEnd w:id="145"/>
     <w:bookmarkEnd w:id="146"/>
+    <w:bookmarkEnd w:id="147"/>
     <w:sectPr>
       <w:footnotePr>
         <w:numRestart w:val="eachSect"/>

</xml_diff>

<commit_message>
Deploying to gh-pages from @ Morrison-Lab/sds@b41f527d687d58a705f51088d4d308184464bd96 🚀
</commit_message>
<xml_diff>
--- a/classification-handout.docx
+++ b/classification-handout.docx
@@ -15,7 +15,7 @@
         <w:pStyle w:val="Date"/>
       </w:pPr>
       <w:r>
-        <w:t xml:space="preserve">Last modified: 2026-10-23 01:51:06 (PDT)</w:t>
+        <w:t xml:space="preserve">Last modified: 2026-10-23 11:56:24 (PDT)</w:t>
       </w:r>
     </w:p>
     <w:bookmarkStart w:id="32" w:name="introduction"/>
@@ -11101,7 +11101,7 @@
                   <m:nor/>
                   <m:sty m:val="p"/>
                 </m:rPr>
-                <m:t>(split the fraction over the sum in its numerator)</m:t>
+                <m:t>(distribute the division over the sum in the numerator)</m:t>
               </m:r>
             </m:e>
             <m:e>

</xml_diff>